<commit_message>
docs: proje planına Markdown kopyası ekle (IDE’de açılabilir)
.docx Cursor içinde doğrudan açılmadığı için aynı içeriğin .md
versiyonu eklendi; Word dosyası yeniden üretildi.

Co-authored-by: barbarosson <barbarosson@users.noreply.github.com>
</commit_message>
<xml_diff>
--- a/docs/bayi-otomatik-faturalama/Bayi_Otomatik_Faturalama_Proje_Plani_Teknik.docx
+++ b/docs/bayi-otomatik-faturalama/Bayi_Otomatik_Faturalama_Proje_Plani_Teknik.docx
@@ -275,7 +275,7 @@
           <w:b w:val="0"/>
           <w:sz w:val="22"/>
         </w:rPr>
-        <w:t>Bayi bazlı PO oluşturma (mevcut Manual TDM PO Template alan modeli baz alınarak)</w:t>
+        <w:t>Bayi bazlı PO oluşturma (Manual TDM PO Template alan modeli baz alınarak)</w:t>
       </w:r>
     </w:p>
     <w:p>
@@ -351,7 +351,7 @@
           <w:b w:val="0"/>
           <w:sz w:val="22"/>
         </w:rPr>
-        <w:t>Mevcut faturalama düzeninin vergi/hukuk onayı ile korunması (Emine Binal Kopuz koordinasyonu)</w:t>
+        <w:t>Mevcut faturalama düzeninin vergi/hukuk onayı ile korunması</w:t>
       </w:r>
     </w:p>
     <w:p>
@@ -377,7 +377,7 @@
           <w:b w:val="0"/>
           <w:sz w:val="22"/>
         </w:rPr>
-        <w:t>Cashstation entegrasyonu kesinleşene kadar dekont yükleme manuel fallback ile desteklenebilir</w:t>
+        <w:t>Cashstation kesinleşene kadar dekont yükleme manuel fallback ile desteklenebilir</w:t>
       </w:r>
     </w:p>
     <w:p>
@@ -608,7 +608,7 @@
       <w:tr>
         <w:tc>
           <w:tcPr>
-            <w:tcW w:type="dxa" w:w="1984"/>
+            <w:tcW w:type="dxa" w:w="3249"/>
             <w:vAlign w:val="center"/>
             <w:shd w:fill="1F3A5F" w:val="clear"/>
           </w:tcPr>
@@ -627,7 +627,7 @@
         </w:tc>
         <w:tc>
           <w:tcPr>
-            <w:tcW w:type="dxa" w:w="3118"/>
+            <w:tcW w:type="dxa" w:w="3249"/>
             <w:vAlign w:val="center"/>
             <w:shd w:fill="1F3A5F" w:val="clear"/>
           </w:tcPr>
@@ -646,7 +646,7 @@
         </w:tc>
         <w:tc>
           <w:tcPr>
-            <w:tcW w:type="dxa" w:w="3969"/>
+            <w:tcW w:type="dxa" w:w="3249"/>
             <w:vAlign w:val="center"/>
             <w:shd w:fill="1F3A5F" w:val="clear"/>
           </w:tcPr>
@@ -667,7 +667,7 @@
       <w:tr>
         <w:tc>
           <w:tcPr>
-            <w:tcW w:type="dxa" w:w="1984"/>
+            <w:tcW w:type="dxa" w:w="3249"/>
             <w:vAlign w:val="center"/>
           </w:tcPr>
           <w:p>
@@ -684,7 +684,7 @@
         </w:tc>
         <w:tc>
           <w:tcPr>
-            <w:tcW w:type="dxa" w:w="3118"/>
+            <w:tcW w:type="dxa" w:w="3249"/>
             <w:vAlign w:val="center"/>
           </w:tcPr>
           <w:p>
@@ -701,7 +701,7 @@
         </w:tc>
         <w:tc>
           <w:tcPr>
-            <w:tcW w:type="dxa" w:w="3969"/>
+            <w:tcW w:type="dxa" w:w="3249"/>
             <w:vAlign w:val="center"/>
           </w:tcPr>
           <w:p>
@@ -720,7 +720,7 @@
       <w:tr>
         <w:tc>
           <w:tcPr>
-            <w:tcW w:type="dxa" w:w="1984"/>
+            <w:tcW w:type="dxa" w:w="3249"/>
             <w:vAlign w:val="center"/>
             <w:shd w:fill="F2F5F8" w:val="clear"/>
           </w:tcPr>
@@ -738,7 +738,7 @@
         </w:tc>
         <w:tc>
           <w:tcPr>
-            <w:tcW w:type="dxa" w:w="3118"/>
+            <w:tcW w:type="dxa" w:w="3249"/>
             <w:vAlign w:val="center"/>
             <w:shd w:fill="F2F5F8" w:val="clear"/>
           </w:tcPr>
@@ -756,7 +756,7 @@
         </w:tc>
         <w:tc>
           <w:tcPr>
-            <w:tcW w:type="dxa" w:w="3969"/>
+            <w:tcW w:type="dxa" w:w="3249"/>
             <w:vAlign w:val="center"/>
             <w:shd w:fill="F2F5F8" w:val="clear"/>
           </w:tcPr>
@@ -776,7 +776,7 @@
       <w:tr>
         <w:tc>
           <w:tcPr>
-            <w:tcW w:type="dxa" w:w="1984"/>
+            <w:tcW w:type="dxa" w:w="3249"/>
             <w:vAlign w:val="center"/>
           </w:tcPr>
           <w:p>
@@ -793,7 +793,7 @@
         </w:tc>
         <w:tc>
           <w:tcPr>
-            <w:tcW w:type="dxa" w:w="3118"/>
+            <w:tcW w:type="dxa" w:w="3249"/>
             <w:vAlign w:val="center"/>
           </w:tcPr>
           <w:p>
@@ -810,7 +810,7 @@
         </w:tc>
         <w:tc>
           <w:tcPr>
-            <w:tcW w:type="dxa" w:w="3969"/>
+            <w:tcW w:type="dxa" w:w="3249"/>
             <w:vAlign w:val="center"/>
           </w:tcPr>
           <w:p>
@@ -829,7 +829,7 @@
       <w:tr>
         <w:tc>
           <w:tcPr>
-            <w:tcW w:type="dxa" w:w="1984"/>
+            <w:tcW w:type="dxa" w:w="3249"/>
             <w:vAlign w:val="center"/>
             <w:shd w:fill="F2F5F8" w:val="clear"/>
           </w:tcPr>
@@ -847,7 +847,7 @@
         </w:tc>
         <w:tc>
           <w:tcPr>
-            <w:tcW w:type="dxa" w:w="3118"/>
+            <w:tcW w:type="dxa" w:w="3249"/>
             <w:vAlign w:val="center"/>
             <w:shd w:fill="F2F5F8" w:val="clear"/>
           </w:tcPr>
@@ -865,7 +865,7 @@
         </w:tc>
         <w:tc>
           <w:tcPr>
-            <w:tcW w:type="dxa" w:w="3969"/>
+            <w:tcW w:type="dxa" w:w="3249"/>
             <w:vAlign w:val="center"/>
             <w:shd w:fill="F2F5F8" w:val="clear"/>
           </w:tcPr>
@@ -885,7 +885,7 @@
       <w:tr>
         <w:tc>
           <w:tcPr>
-            <w:tcW w:type="dxa" w:w="1984"/>
+            <w:tcW w:type="dxa" w:w="3249"/>
             <w:vAlign w:val="center"/>
           </w:tcPr>
           <w:p>
@@ -902,7 +902,7 @@
         </w:tc>
         <w:tc>
           <w:tcPr>
-            <w:tcW w:type="dxa" w:w="3118"/>
+            <w:tcW w:type="dxa" w:w="3249"/>
             <w:vAlign w:val="center"/>
           </w:tcPr>
           <w:p>
@@ -919,7 +919,7 @@
         </w:tc>
         <w:tc>
           <w:tcPr>
-            <w:tcW w:type="dxa" w:w="3969"/>
+            <w:tcW w:type="dxa" w:w="3249"/>
             <w:vAlign w:val="center"/>
           </w:tcPr>
           <w:p>
@@ -938,7 +938,7 @@
       <w:tr>
         <w:tc>
           <w:tcPr>
-            <w:tcW w:type="dxa" w:w="1984"/>
+            <w:tcW w:type="dxa" w:w="3249"/>
             <w:vAlign w:val="center"/>
             <w:shd w:fill="F2F5F8" w:val="clear"/>
           </w:tcPr>
@@ -956,7 +956,7 @@
         </w:tc>
         <w:tc>
           <w:tcPr>
-            <w:tcW w:type="dxa" w:w="3118"/>
+            <w:tcW w:type="dxa" w:w="3249"/>
             <w:vAlign w:val="center"/>
             <w:shd w:fill="F2F5F8" w:val="clear"/>
           </w:tcPr>
@@ -974,7 +974,7 @@
         </w:tc>
         <w:tc>
           <w:tcPr>
-            <w:tcW w:type="dxa" w:w="3969"/>
+            <w:tcW w:type="dxa" w:w="3249"/>
             <w:vAlign w:val="center"/>
             <w:shd w:fill="F2F5F8" w:val="clear"/>
           </w:tcPr>
@@ -1014,7 +1014,7 @@
           <w:b w:val="0"/>
           <w:sz w:val="22"/>
         </w:rPr>
-        <w:t>Kullanıcı arayüzü ve süreç yönetimi Oracle EBS üzerinde konumlandırılacaktır. Aşağıdaki ekran seti analiz dokümanındaki 3.1.1 maddesine dayanır ve proje kapsamında detaylandırılmıştır.</w:t>
+        <w:t>Kullanıcı arayüzü ve süreç yönetimi Oracle EBS üzerinde konumlandırılacaktır.</w:t>
       </w:r>
     </w:p>
     <w:p>
@@ -1103,7 +1103,7 @@
           <w:b w:val="0"/>
           <w:sz w:val="22"/>
         </w:rPr>
-        <w:t>Teknik: XX_BOF_HAKEDIS_HDR / XX_BOF_HAKEDIS_LN tabloları; XXBOF_UPLOAD concurrent; UTL_FILE veya WebADI benzeri upload</w:t>
+        <w:t>Teknik: XX_BOF_HAKEDIS_HDR / XX_BOF_HAKEDIS_LN; XXBOF_UPLOAD concurrent</w:t>
       </w:r>
     </w:p>
     <w:p>
@@ -1229,7 +1229,7 @@
           <w:b w:val="0"/>
           <w:sz w:val="22"/>
         </w:rPr>
-        <w:t>Kaynak: İş birimlerinden (Alp Nalbantoğlu / Gözde Benli) kurumsal kart listesi</w:t>
+        <w:t>Kaynak: İş birimlerinden kurumsal kart listesi</w:t>
       </w:r>
     </w:p>
     <w:p>
@@ -1253,7 +1253,7 @@
         <w:rPr>
           <w:color w:val="1F3A5F"/>
         </w:rPr>
-        <w:t>4.4 Onay ve Hiyerarşi Ekranı / Parametreleri</w:t>
+        <w:t>4.4 Onay ve Hiyerarşi / Parametreler</w:t>
       </w:r>
     </w:p>
     <w:p>
@@ -1266,7 +1266,7 @@
           <w:b w:val="0"/>
           <w:sz w:val="22"/>
         </w:rPr>
-        <w:t>Oracle EBS AME veya mevcut onay hiyerarşi kodları (PO şablonundaki ONAY_HIYERARSISI) kullanılır</w:t>
+        <w:t>Oracle EBS AME veya mevcut onay hiyerarşi kodları (ONAY_HIYERARSISI) kullanılır</w:t>
       </w:r>
     </w:p>
     <w:p>
@@ -1366,7 +1366,7 @@
           <w:b w:val="0"/>
           <w:sz w:val="22"/>
         </w:rPr>
-        <w:t>Satın alma ekiplerinin kullandığı “Copy of Manual_TDM_PO_Template.xlsx” dosyasının tüm sheetleri incelenmiştir. Otomatik PO üretimi bu alan modelini Oracle EBS API/interface katmanına taşıyacaktır.</w:t>
+        <w:t>Copy of Manual_TDM_PO_Template.xlsx dosyasının tüm sheetleri incelenmiştir. Otomatik PO üretimi bu alan modelini Oracle EBS API/interface katmanına taşıyacaktır.</w:t>
       </w:r>
     </w:p>
     <w:p>
@@ -1395,7 +1395,7 @@
       <w:tr>
         <w:tc>
           <w:tcPr>
-            <w:tcW w:type="dxa" w:w="2551"/>
+            <w:tcW w:type="dxa" w:w="3249"/>
             <w:vAlign w:val="center"/>
             <w:shd w:fill="1F3A5F" w:val="clear"/>
           </w:tcPr>
@@ -1414,7 +1414,7 @@
         </w:tc>
         <w:tc>
           <w:tcPr>
-            <w:tcW w:type="dxa" w:w="3402"/>
+            <w:tcW w:type="dxa" w:w="3249"/>
             <w:vAlign w:val="center"/>
             <w:shd w:fill="1F3A5F" w:val="clear"/>
           </w:tcPr>
@@ -1433,7 +1433,7 @@
         </w:tc>
         <w:tc>
           <w:tcPr>
-            <w:tcW w:type="dxa" w:w="3118"/>
+            <w:tcW w:type="dxa" w:w="3249"/>
             <w:vAlign w:val="center"/>
             <w:shd w:fill="1F3A5F" w:val="clear"/>
           </w:tcPr>
@@ -1454,7 +1454,7 @@
       <w:tr>
         <w:tc>
           <w:tcPr>
-            <w:tcW w:type="dxa" w:w="2551"/>
+            <w:tcW w:type="dxa" w:w="3249"/>
             <w:vAlign w:val="center"/>
           </w:tcPr>
           <w:p>
@@ -1471,7 +1471,7 @@
         </w:tc>
         <w:tc>
           <w:tcPr>
-            <w:tcW w:type="dxa" w:w="3402"/>
+            <w:tcW w:type="dxa" w:w="3249"/>
             <w:vAlign w:val="center"/>
           </w:tcPr>
           <w:p>
@@ -1488,7 +1488,7 @@
         </w:tc>
         <w:tc>
           <w:tcPr>
-            <w:tcW w:type="dxa" w:w="3118"/>
+            <w:tcW w:type="dxa" w:w="3249"/>
             <w:vAlign w:val="center"/>
           </w:tcPr>
           <w:p>
@@ -1507,7 +1507,7 @@
       <w:tr>
         <w:tc>
           <w:tcPr>
-            <w:tcW w:type="dxa" w:w="2551"/>
+            <w:tcW w:type="dxa" w:w="3249"/>
             <w:vAlign w:val="center"/>
             <w:shd w:fill="F2F5F8" w:val="clear"/>
           </w:tcPr>
@@ -1525,7 +1525,7 @@
         </w:tc>
         <w:tc>
           <w:tcPr>
-            <w:tcW w:type="dxa" w:w="3402"/>
+            <w:tcW w:type="dxa" w:w="3249"/>
             <w:vAlign w:val="center"/>
             <w:shd w:fill="F2F5F8" w:val="clear"/>
           </w:tcPr>
@@ -1543,7 +1543,7 @@
         </w:tc>
         <w:tc>
           <w:tcPr>
-            <w:tcW w:type="dxa" w:w="3118"/>
+            <w:tcW w:type="dxa" w:w="3249"/>
             <w:vAlign w:val="center"/>
             <w:shd w:fill="F2F5F8" w:val="clear"/>
           </w:tcPr>
@@ -1563,7 +1563,7 @@
       <w:tr>
         <w:tc>
           <w:tcPr>
-            <w:tcW w:type="dxa" w:w="2551"/>
+            <w:tcW w:type="dxa" w:w="3249"/>
             <w:vAlign w:val="center"/>
           </w:tcPr>
           <w:p>
@@ -1580,7 +1580,7 @@
         </w:tc>
         <w:tc>
           <w:tcPr>
-            <w:tcW w:type="dxa" w:w="3402"/>
+            <w:tcW w:type="dxa" w:w="3249"/>
             <w:vAlign w:val="center"/>
           </w:tcPr>
           <w:p>
@@ -1597,7 +1597,7 @@
         </w:tc>
         <w:tc>
           <w:tcPr>
-            <w:tcW w:type="dxa" w:w="3118"/>
+            <w:tcW w:type="dxa" w:w="3249"/>
             <w:vAlign w:val="center"/>
           </w:tcPr>
           <w:p>
@@ -1616,7 +1616,7 @@
       <w:tr>
         <w:tc>
           <w:tcPr>
-            <w:tcW w:type="dxa" w:w="2551"/>
+            <w:tcW w:type="dxa" w:w="3249"/>
             <w:vAlign w:val="center"/>
             <w:shd w:fill="F2F5F8" w:val="clear"/>
           </w:tcPr>
@@ -1634,7 +1634,7 @@
         </w:tc>
         <w:tc>
           <w:tcPr>
-            <w:tcW w:type="dxa" w:w="3402"/>
+            <w:tcW w:type="dxa" w:w="3249"/>
             <w:vAlign w:val="center"/>
             <w:shd w:fill="F2F5F8" w:val="clear"/>
           </w:tcPr>
@@ -1652,7 +1652,7 @@
         </w:tc>
         <w:tc>
           <w:tcPr>
-            <w:tcW w:type="dxa" w:w="3118"/>
+            <w:tcW w:type="dxa" w:w="3249"/>
             <w:vAlign w:val="center"/>
             <w:shd w:fill="F2F5F8" w:val="clear"/>
           </w:tcPr>
@@ -1697,7 +1697,7 @@
       <w:tr>
         <w:tc>
           <w:tcPr>
-            <w:tcW w:type="dxa" w:w="2268"/>
+            <w:tcW w:type="dxa" w:w="3249"/>
             <w:vAlign w:val="center"/>
             <w:shd w:fill="1F3A5F" w:val="clear"/>
           </w:tcPr>
@@ -1716,7 +1716,7 @@
         </w:tc>
         <w:tc>
           <w:tcPr>
-            <w:tcW w:type="dxa" w:w="3402"/>
+            <w:tcW w:type="dxa" w:w="3249"/>
             <w:vAlign w:val="center"/>
             <w:shd w:fill="1F3A5F" w:val="clear"/>
           </w:tcPr>
@@ -1735,7 +1735,7 @@
         </w:tc>
         <w:tc>
           <w:tcPr>
-            <w:tcW w:type="dxa" w:w="3402"/>
+            <w:tcW w:type="dxa" w:w="3249"/>
             <w:vAlign w:val="center"/>
             <w:shd w:fill="1F3A5F" w:val="clear"/>
           </w:tcPr>
@@ -1756,7 +1756,7 @@
       <w:tr>
         <w:tc>
           <w:tcPr>
-            <w:tcW w:type="dxa" w:w="2268"/>
+            <w:tcW w:type="dxa" w:w="3249"/>
             <w:vAlign w:val="center"/>
           </w:tcPr>
           <w:p>
@@ -1773,7 +1773,7 @@
         </w:tc>
         <w:tc>
           <w:tcPr>
-            <w:tcW w:type="dxa" w:w="3402"/>
+            <w:tcW w:type="dxa" w:w="3249"/>
             <w:vAlign w:val="center"/>
           </w:tcPr>
           <w:p>
@@ -1790,7 +1790,7 @@
         </w:tc>
         <w:tc>
           <w:tcPr>
-            <w:tcW w:type="dxa" w:w="3402"/>
+            <w:tcW w:type="dxa" w:w="3249"/>
             <w:vAlign w:val="center"/>
           </w:tcPr>
           <w:p>
@@ -1809,7 +1809,7 @@
       <w:tr>
         <w:tc>
           <w:tcPr>
-            <w:tcW w:type="dxa" w:w="2268"/>
+            <w:tcW w:type="dxa" w:w="3249"/>
             <w:vAlign w:val="center"/>
             <w:shd w:fill="F2F5F8" w:val="clear"/>
           </w:tcPr>
@@ -1827,7 +1827,7 @@
         </w:tc>
         <w:tc>
           <w:tcPr>
-            <w:tcW w:type="dxa" w:w="3402"/>
+            <w:tcW w:type="dxa" w:w="3249"/>
             <w:vAlign w:val="center"/>
             <w:shd w:fill="F2F5F8" w:val="clear"/>
           </w:tcPr>
@@ -1845,7 +1845,7 @@
         </w:tc>
         <w:tc>
           <w:tcPr>
-            <w:tcW w:type="dxa" w:w="3402"/>
+            <w:tcW w:type="dxa" w:w="3249"/>
             <w:vAlign w:val="center"/>
             <w:shd w:fill="F2F5F8" w:val="clear"/>
           </w:tcPr>
@@ -1865,7 +1865,7 @@
       <w:tr>
         <w:tc>
           <w:tcPr>
-            <w:tcW w:type="dxa" w:w="2268"/>
+            <w:tcW w:type="dxa" w:w="3249"/>
             <w:vAlign w:val="center"/>
           </w:tcPr>
           <w:p>
@@ -1882,7 +1882,7 @@
         </w:tc>
         <w:tc>
           <w:tcPr>
-            <w:tcW w:type="dxa" w:w="3402"/>
+            <w:tcW w:type="dxa" w:w="3249"/>
             <w:vAlign w:val="center"/>
           </w:tcPr>
           <w:p>
@@ -1899,7 +1899,7 @@
         </w:tc>
         <w:tc>
           <w:tcPr>
-            <w:tcW w:type="dxa" w:w="3402"/>
+            <w:tcW w:type="dxa" w:w="3249"/>
             <w:vAlign w:val="center"/>
           </w:tcPr>
           <w:p>
@@ -1918,7 +1918,7 @@
       <w:tr>
         <w:tc>
           <w:tcPr>
-            <w:tcW w:type="dxa" w:w="2268"/>
+            <w:tcW w:type="dxa" w:w="3249"/>
             <w:vAlign w:val="center"/>
             <w:shd w:fill="F2F5F8" w:val="clear"/>
           </w:tcPr>
@@ -1936,7 +1936,7 @@
         </w:tc>
         <w:tc>
           <w:tcPr>
-            <w:tcW w:type="dxa" w:w="3402"/>
+            <w:tcW w:type="dxa" w:w="3249"/>
             <w:vAlign w:val="center"/>
             <w:shd w:fill="F2F5F8" w:val="clear"/>
           </w:tcPr>
@@ -1954,7 +1954,7 @@
         </w:tc>
         <w:tc>
           <w:tcPr>
-            <w:tcW w:type="dxa" w:w="3402"/>
+            <w:tcW w:type="dxa" w:w="3249"/>
             <w:vAlign w:val="center"/>
             <w:shd w:fill="F2F5F8" w:val="clear"/>
           </w:tcPr>
@@ -1974,7 +1974,7 @@
       <w:tr>
         <w:tc>
           <w:tcPr>
-            <w:tcW w:type="dxa" w:w="2268"/>
+            <w:tcW w:type="dxa" w:w="3249"/>
             <w:vAlign w:val="center"/>
           </w:tcPr>
           <w:p>
@@ -1991,7 +1991,7 @@
         </w:tc>
         <w:tc>
           <w:tcPr>
-            <w:tcW w:type="dxa" w:w="3402"/>
+            <w:tcW w:type="dxa" w:w="3249"/>
             <w:vAlign w:val="center"/>
           </w:tcPr>
           <w:p>
@@ -2008,7 +2008,7 @@
         </w:tc>
         <w:tc>
           <w:tcPr>
-            <w:tcW w:type="dxa" w:w="3402"/>
+            <w:tcW w:type="dxa" w:w="3249"/>
             <w:vAlign w:val="center"/>
           </w:tcPr>
           <w:p>
@@ -2027,7 +2027,7 @@
       <w:tr>
         <w:tc>
           <w:tcPr>
-            <w:tcW w:type="dxa" w:w="2268"/>
+            <w:tcW w:type="dxa" w:w="3249"/>
             <w:vAlign w:val="center"/>
             <w:shd w:fill="F2F5F8" w:val="clear"/>
           </w:tcPr>
@@ -2045,7 +2045,7 @@
         </w:tc>
         <w:tc>
           <w:tcPr>
-            <w:tcW w:type="dxa" w:w="3402"/>
+            <w:tcW w:type="dxa" w:w="3249"/>
             <w:vAlign w:val="center"/>
             <w:shd w:fill="F2F5F8" w:val="clear"/>
           </w:tcPr>
@@ -2063,7 +2063,7 @@
         </w:tc>
         <w:tc>
           <w:tcPr>
-            <w:tcW w:type="dxa" w:w="3402"/>
+            <w:tcW w:type="dxa" w:w="3249"/>
             <w:vAlign w:val="center"/>
             <w:shd w:fill="F2F5F8" w:val="clear"/>
           </w:tcPr>
@@ -2083,7 +2083,7 @@
       <w:tr>
         <w:tc>
           <w:tcPr>
-            <w:tcW w:type="dxa" w:w="2268"/>
+            <w:tcW w:type="dxa" w:w="3249"/>
             <w:vAlign w:val="center"/>
           </w:tcPr>
           <w:p>
@@ -2100,7 +2100,7 @@
         </w:tc>
         <w:tc>
           <w:tcPr>
-            <w:tcW w:type="dxa" w:w="3402"/>
+            <w:tcW w:type="dxa" w:w="3249"/>
             <w:vAlign w:val="center"/>
           </w:tcPr>
           <w:p>
@@ -2117,7 +2117,7 @@
         </w:tc>
         <w:tc>
           <w:tcPr>
-            <w:tcW w:type="dxa" w:w="3402"/>
+            <w:tcW w:type="dxa" w:w="3249"/>
             <w:vAlign w:val="center"/>
           </w:tcPr>
           <w:p>
@@ -2136,7 +2136,7 @@
       <w:tr>
         <w:tc>
           <w:tcPr>
-            <w:tcW w:type="dxa" w:w="2268"/>
+            <w:tcW w:type="dxa" w:w="3249"/>
             <w:vAlign w:val="center"/>
             <w:shd w:fill="F2F5F8" w:val="clear"/>
           </w:tcPr>
@@ -2154,7 +2154,7 @@
         </w:tc>
         <w:tc>
           <w:tcPr>
-            <w:tcW w:type="dxa" w:w="3402"/>
+            <w:tcW w:type="dxa" w:w="3249"/>
             <w:vAlign w:val="center"/>
             <w:shd w:fill="F2F5F8" w:val="clear"/>
           </w:tcPr>
@@ -2172,7 +2172,7 @@
         </w:tc>
         <w:tc>
           <w:tcPr>
-            <w:tcW w:type="dxa" w:w="3402"/>
+            <w:tcW w:type="dxa" w:w="3249"/>
             <w:vAlign w:val="center"/>
             <w:shd w:fill="F2F5F8" w:val="clear"/>
           </w:tcPr>
@@ -2192,7 +2192,7 @@
       <w:tr>
         <w:tc>
           <w:tcPr>
-            <w:tcW w:type="dxa" w:w="2268"/>
+            <w:tcW w:type="dxa" w:w="3249"/>
             <w:vAlign w:val="center"/>
           </w:tcPr>
           <w:p>
@@ -2209,7 +2209,7 @@
         </w:tc>
         <w:tc>
           <w:tcPr>
-            <w:tcW w:type="dxa" w:w="3402"/>
+            <w:tcW w:type="dxa" w:w="3249"/>
             <w:vAlign w:val="center"/>
           </w:tcPr>
           <w:p>
@@ -2226,7 +2226,7 @@
         </w:tc>
         <w:tc>
           <w:tcPr>
-            <w:tcW w:type="dxa" w:w="3402"/>
+            <w:tcW w:type="dxa" w:w="3249"/>
             <w:vAlign w:val="center"/>
           </w:tcPr>
           <w:p>
@@ -2245,7 +2245,7 @@
       <w:tr>
         <w:tc>
           <w:tcPr>
-            <w:tcW w:type="dxa" w:w="2268"/>
+            <w:tcW w:type="dxa" w:w="3249"/>
             <w:vAlign w:val="center"/>
             <w:shd w:fill="F2F5F8" w:val="clear"/>
           </w:tcPr>
@@ -2263,7 +2263,7 @@
         </w:tc>
         <w:tc>
           <w:tcPr>
-            <w:tcW w:type="dxa" w:w="3402"/>
+            <w:tcW w:type="dxa" w:w="3249"/>
             <w:vAlign w:val="center"/>
             <w:shd w:fill="F2F5F8" w:val="clear"/>
           </w:tcPr>
@@ -2281,7 +2281,7 @@
         </w:tc>
         <w:tc>
           <w:tcPr>
-            <w:tcW w:type="dxa" w:w="3402"/>
+            <w:tcW w:type="dxa" w:w="3249"/>
             <w:vAlign w:val="center"/>
             <w:shd w:fill="F2F5F8" w:val="clear"/>
           </w:tcPr>
@@ -2334,7 +2334,7 @@
           <w:b w:val="0"/>
           <w:sz w:val="22"/>
         </w:rPr>
-        <w:t>Örnek Data sheet’inde 733 satırın tamamı DEALER_TYPE=TIM olarak gelmiştir. Sistemde bu liste değer seti (lookup) olarak tutulmalı; ERP’den vendor-bayi eşleşmesi bulunamazsa VENDOR_ID / VENDOR_SITE_ID BYS veya Oracle AP vendor master’dan tamamlanmalıdır.</w:t>
+        <w:t>Örnek Data sheet’inde 733 satırın tamamı DEALER_TYPE=TIM. Sistemde bu liste lookup olarak tutulmalı; VENDOR_ID / VENDOR_SITE_ID eksikse Oracle AP vendor master’dan tamamlanmalıdır.</w:t>
       </w:r>
     </w:p>
     <w:p>
@@ -2363,7 +2363,7 @@
       <w:tr>
         <w:tc>
           <w:tcPr>
-            <w:tcW w:type="dxa" w:w="1417"/>
+            <w:tcW w:type="dxa" w:w="3249"/>
             <w:vAlign w:val="center"/>
             <w:shd w:fill="1F3A5F" w:val="clear"/>
           </w:tcPr>
@@ -2382,7 +2382,7 @@
         </w:tc>
         <w:tc>
           <w:tcPr>
-            <w:tcW w:type="dxa" w:w="3402"/>
+            <w:tcW w:type="dxa" w:w="3249"/>
             <w:vAlign w:val="center"/>
             <w:shd w:fill="1F3A5F" w:val="clear"/>
           </w:tcPr>
@@ -2401,7 +2401,7 @@
         </w:tc>
         <w:tc>
           <w:tcPr>
-            <w:tcW w:type="dxa" w:w="4252"/>
+            <w:tcW w:type="dxa" w:w="3249"/>
             <w:vAlign w:val="center"/>
             <w:shd w:fill="1F3A5F" w:val="clear"/>
           </w:tcPr>
@@ -2422,7 +2422,7 @@
       <w:tr>
         <w:tc>
           <w:tcPr>
-            <w:tcW w:type="dxa" w:w="1417"/>
+            <w:tcW w:type="dxa" w:w="3249"/>
             <w:vAlign w:val="center"/>
           </w:tcPr>
           <w:p>
@@ -2439,7 +2439,7 @@
         </w:tc>
         <w:tc>
           <w:tcPr>
-            <w:tcW w:type="dxa" w:w="3402"/>
+            <w:tcW w:type="dxa" w:w="3249"/>
             <w:vAlign w:val="center"/>
           </w:tcPr>
           <w:p>
@@ -2456,7 +2456,7 @@
         </w:tc>
         <w:tc>
           <w:tcPr>
-            <w:tcW w:type="dxa" w:w="4252"/>
+            <w:tcW w:type="dxa" w:w="3249"/>
             <w:vAlign w:val="center"/>
           </w:tcPr>
           <w:p>
@@ -2475,7 +2475,7 @@
       <w:tr>
         <w:tc>
           <w:tcPr>
-            <w:tcW w:type="dxa" w:w="1417"/>
+            <w:tcW w:type="dxa" w:w="3249"/>
             <w:vAlign w:val="center"/>
             <w:shd w:fill="F2F5F8" w:val="clear"/>
           </w:tcPr>
@@ -2493,7 +2493,7 @@
         </w:tc>
         <w:tc>
           <w:tcPr>
-            <w:tcW w:type="dxa" w:w="3402"/>
+            <w:tcW w:type="dxa" w:w="3249"/>
             <w:vAlign w:val="center"/>
             <w:shd w:fill="F2F5F8" w:val="clear"/>
           </w:tcPr>
@@ -2511,7 +2511,7 @@
         </w:tc>
         <w:tc>
           <w:tcPr>
-            <w:tcW w:type="dxa" w:w="4252"/>
+            <w:tcW w:type="dxa" w:w="3249"/>
             <w:vAlign w:val="center"/>
             <w:shd w:fill="F2F5F8" w:val="clear"/>
           </w:tcPr>
@@ -2531,7 +2531,7 @@
       <w:tr>
         <w:tc>
           <w:tcPr>
-            <w:tcW w:type="dxa" w:w="1417"/>
+            <w:tcW w:type="dxa" w:w="3249"/>
             <w:vAlign w:val="center"/>
           </w:tcPr>
           <w:p>
@@ -2548,7 +2548,7 @@
         </w:tc>
         <w:tc>
           <w:tcPr>
-            <w:tcW w:type="dxa" w:w="3402"/>
+            <w:tcW w:type="dxa" w:w="3249"/>
             <w:vAlign w:val="center"/>
           </w:tcPr>
           <w:p>
@@ -2565,7 +2565,7 @@
         </w:tc>
         <w:tc>
           <w:tcPr>
-            <w:tcW w:type="dxa" w:w="4252"/>
+            <w:tcW w:type="dxa" w:w="3249"/>
             <w:vAlign w:val="center"/>
           </w:tcPr>
           <w:p>
@@ -2584,7 +2584,7 @@
       <w:tr>
         <w:tc>
           <w:tcPr>
-            <w:tcW w:type="dxa" w:w="1417"/>
+            <w:tcW w:type="dxa" w:w="3249"/>
             <w:vAlign w:val="center"/>
             <w:shd w:fill="F2F5F8" w:val="clear"/>
           </w:tcPr>
@@ -2602,7 +2602,7 @@
         </w:tc>
         <w:tc>
           <w:tcPr>
-            <w:tcW w:type="dxa" w:w="3402"/>
+            <w:tcW w:type="dxa" w:w="3249"/>
             <w:vAlign w:val="center"/>
             <w:shd w:fill="F2F5F8" w:val="clear"/>
           </w:tcPr>
@@ -2620,7 +2620,7 @@
         </w:tc>
         <w:tc>
           <w:tcPr>
-            <w:tcW w:type="dxa" w:w="4252"/>
+            <w:tcW w:type="dxa" w:w="3249"/>
             <w:vAlign w:val="center"/>
             <w:shd w:fill="F2F5F8" w:val="clear"/>
           </w:tcPr>
@@ -2640,7 +2640,7 @@
       <w:tr>
         <w:tc>
           <w:tcPr>
-            <w:tcW w:type="dxa" w:w="1417"/>
+            <w:tcW w:type="dxa" w:w="3249"/>
             <w:vAlign w:val="center"/>
           </w:tcPr>
           <w:p>
@@ -2657,7 +2657,7 @@
         </w:tc>
         <w:tc>
           <w:tcPr>
-            <w:tcW w:type="dxa" w:w="3402"/>
+            <w:tcW w:type="dxa" w:w="3249"/>
             <w:vAlign w:val="center"/>
           </w:tcPr>
           <w:p>
@@ -2674,7 +2674,7 @@
         </w:tc>
         <w:tc>
           <w:tcPr>
-            <w:tcW w:type="dxa" w:w="4252"/>
+            <w:tcW w:type="dxa" w:w="3249"/>
             <w:vAlign w:val="center"/>
           </w:tcPr>
           <w:p>
@@ -2693,7 +2693,7 @@
       <w:tr>
         <w:tc>
           <w:tcPr>
-            <w:tcW w:type="dxa" w:w="1417"/>
+            <w:tcW w:type="dxa" w:w="3249"/>
             <w:vAlign w:val="center"/>
             <w:shd w:fill="F2F5F8" w:val="clear"/>
           </w:tcPr>
@@ -2711,7 +2711,7 @@
         </w:tc>
         <w:tc>
           <w:tcPr>
-            <w:tcW w:type="dxa" w:w="3402"/>
+            <w:tcW w:type="dxa" w:w="3249"/>
             <w:vAlign w:val="center"/>
             <w:shd w:fill="F2F5F8" w:val="clear"/>
           </w:tcPr>
@@ -2729,7 +2729,7 @@
         </w:tc>
         <w:tc>
           <w:tcPr>
-            <w:tcW w:type="dxa" w:w="4252"/>
+            <w:tcW w:type="dxa" w:w="3249"/>
             <w:vAlign w:val="center"/>
             <w:shd w:fill="F2F5F8" w:val="clear"/>
           </w:tcPr>
@@ -2749,7 +2749,7 @@
       <w:tr>
         <w:tc>
           <w:tcPr>
-            <w:tcW w:type="dxa" w:w="1417"/>
+            <w:tcW w:type="dxa" w:w="3249"/>
             <w:vAlign w:val="center"/>
           </w:tcPr>
           <w:p>
@@ -2766,7 +2766,7 @@
         </w:tc>
         <w:tc>
           <w:tcPr>
-            <w:tcW w:type="dxa" w:w="3402"/>
+            <w:tcW w:type="dxa" w:w="3249"/>
             <w:vAlign w:val="center"/>
           </w:tcPr>
           <w:p>
@@ -2783,7 +2783,7 @@
         </w:tc>
         <w:tc>
           <w:tcPr>
-            <w:tcW w:type="dxa" w:w="4252"/>
+            <w:tcW w:type="dxa" w:w="3249"/>
             <w:vAlign w:val="center"/>
           </w:tcPr>
           <w:p>
@@ -2802,7 +2802,7 @@
       <w:tr>
         <w:tc>
           <w:tcPr>
-            <w:tcW w:type="dxa" w:w="1417"/>
+            <w:tcW w:type="dxa" w:w="3249"/>
             <w:vAlign w:val="center"/>
             <w:shd w:fill="F2F5F8" w:val="clear"/>
           </w:tcPr>
@@ -2820,7 +2820,7 @@
         </w:tc>
         <w:tc>
           <w:tcPr>
-            <w:tcW w:type="dxa" w:w="3402"/>
+            <w:tcW w:type="dxa" w:w="3249"/>
             <w:vAlign w:val="center"/>
             <w:shd w:fill="F2F5F8" w:val="clear"/>
           </w:tcPr>
@@ -2838,7 +2838,7 @@
         </w:tc>
         <w:tc>
           <w:tcPr>
-            <w:tcW w:type="dxa" w:w="4252"/>
+            <w:tcW w:type="dxa" w:w="3249"/>
             <w:vAlign w:val="center"/>
             <w:shd w:fill="F2F5F8" w:val="clear"/>
           </w:tcPr>
@@ -2858,7 +2858,7 @@
       <w:tr>
         <w:tc>
           <w:tcPr>
-            <w:tcW w:type="dxa" w:w="1417"/>
+            <w:tcW w:type="dxa" w:w="3249"/>
             <w:vAlign w:val="center"/>
           </w:tcPr>
           <w:p>
@@ -2875,7 +2875,7 @@
         </w:tc>
         <w:tc>
           <w:tcPr>
-            <w:tcW w:type="dxa" w:w="3402"/>
+            <w:tcW w:type="dxa" w:w="3249"/>
             <w:vAlign w:val="center"/>
           </w:tcPr>
           <w:p>
@@ -2892,7 +2892,7 @@
         </w:tc>
         <w:tc>
           <w:tcPr>
-            <w:tcW w:type="dxa" w:w="4252"/>
+            <w:tcW w:type="dxa" w:w="3249"/>
             <w:vAlign w:val="center"/>
           </w:tcPr>
           <w:p>
@@ -2920,7 +2920,7 @@
           <w:b/>
           <w:sz w:val="22"/>
         </w:rPr>
-        <w:t>Açık nokta: Örnek Data satırlarında ONAY_HIYERARSISI=339 kullanılmıştır; Onay_Hiyerarsisi sheet’inde 339 kodu yer almamaktadır. Mapping tablosuna eksik kodların (iş birimi + satın alma ile) eklenmesi gerekir.</w:t>
+        <w:t>Açık nokta: Örnek Data satırlarında ONAY_HIYERARSISI=339 kullanılmıştır; Onay_Hiyerarsisi sheet’inde 339 kodu yer almamaktadır. Mapping tablosuna eksik kodların eklenmesi gerekir.</w:t>
       </w:r>
     </w:p>
     <w:p>
@@ -2931,7 +2931,7 @@
         <w:rPr>
           <w:color w:val="1F3A5F"/>
         </w:rPr>
-        <w:t>5.5 Şablon Operasyon Kuralları (Mevcut Manuel Süreç)</w:t>
+        <w:t>5.5 Şablon Operasyon Kuralları</w:t>
       </w:r>
     </w:p>
     <w:p>
@@ -2996,7 +2996,7 @@
           <w:b w:val="0"/>
           <w:sz w:val="22"/>
         </w:rPr>
-        <w:t>Otomasyonda bu kurallar: interface tablo kolon adları sabit tutulacak; dosya taşıma yerine Oracle Purchasing PO Create API / custom concurrent ile doğrudan PO header-line üretilecek.</w:t>
+        <w:t>Otomasyonda interface tablo kolon adları sabit tutulacak; dosya taşıma yerine Oracle Purchasing PO Create API / custom concurrent ile doğrudan PO üretilecek.</w:t>
       </w:r>
     </w:p>
     <w:p>
@@ -3007,7 +3007,7 @@
         <w:rPr>
           <w:color w:val="1F3A5F"/>
         </w:rPr>
-        <w:t>5.6 Örnek Veri Profili (Template Snapshot)</w:t>
+        <w:t>5.6 Örnek Veri Profili</w:t>
       </w:r>
     </w:p>
     <w:tbl>
@@ -3024,7 +3024,7 @@
       <w:tr>
         <w:tc>
           <w:tcPr>
-            <w:tcW w:type="dxa" w:w="3402"/>
+            <w:tcW w:type="dxa" w:w="4873"/>
             <w:vAlign w:val="center"/>
             <w:shd w:fill="1F3A5F" w:val="clear"/>
           </w:tcPr>
@@ -3043,7 +3043,7 @@
         </w:tc>
         <w:tc>
           <w:tcPr>
-            <w:tcW w:type="dxa" w:w="5669"/>
+            <w:tcW w:type="dxa" w:w="4873"/>
             <w:vAlign w:val="center"/>
             <w:shd w:fill="1F3A5F" w:val="clear"/>
           </w:tcPr>
@@ -3064,7 +3064,7 @@
       <w:tr>
         <w:tc>
           <w:tcPr>
-            <w:tcW w:type="dxa" w:w="3402"/>
+            <w:tcW w:type="dxa" w:w="4873"/>
             <w:vAlign w:val="center"/>
           </w:tcPr>
           <w:p>
@@ -3081,7 +3081,7 @@
         </w:tc>
         <w:tc>
           <w:tcPr>
-            <w:tcW w:type="dxa" w:w="5669"/>
+            <w:tcW w:type="dxa" w:w="4873"/>
             <w:vAlign w:val="center"/>
           </w:tcPr>
           <w:p>
@@ -3100,7 +3100,7 @@
       <w:tr>
         <w:tc>
           <w:tcPr>
-            <w:tcW w:type="dxa" w:w="3402"/>
+            <w:tcW w:type="dxa" w:w="4873"/>
             <w:vAlign w:val="center"/>
             <w:shd w:fill="F2F5F8" w:val="clear"/>
           </w:tcPr>
@@ -3118,7 +3118,7 @@
         </w:tc>
         <w:tc>
           <w:tcPr>
-            <w:tcW w:type="dxa" w:w="5669"/>
+            <w:tcW w:type="dxa" w:w="4873"/>
             <w:vAlign w:val="center"/>
             <w:shd w:fill="F2F5F8" w:val="clear"/>
           </w:tcPr>
@@ -3138,7 +3138,7 @@
       <w:tr>
         <w:tc>
           <w:tcPr>
-            <w:tcW w:type="dxa" w:w="3402"/>
+            <w:tcW w:type="dxa" w:w="4873"/>
             <w:vAlign w:val="center"/>
           </w:tcPr>
           <w:p>
@@ -3155,7 +3155,7 @@
         </w:tc>
         <w:tc>
           <w:tcPr>
-            <w:tcW w:type="dxa" w:w="5669"/>
+            <w:tcW w:type="dxa" w:w="4873"/>
             <w:vAlign w:val="center"/>
           </w:tcPr>
           <w:p>
@@ -3174,7 +3174,7 @@
       <w:tr>
         <w:tc>
           <w:tcPr>
-            <w:tcW w:type="dxa" w:w="3402"/>
+            <w:tcW w:type="dxa" w:w="4873"/>
             <w:vAlign w:val="center"/>
             <w:shd w:fill="F2F5F8" w:val="clear"/>
           </w:tcPr>
@@ -3192,7 +3192,7 @@
         </w:tc>
         <w:tc>
           <w:tcPr>
-            <w:tcW w:type="dxa" w:w="5669"/>
+            <w:tcW w:type="dxa" w:w="4873"/>
             <w:vAlign w:val="center"/>
             <w:shd w:fill="F2F5F8" w:val="clear"/>
           </w:tcPr>
@@ -3212,7 +3212,7 @@
       <w:tr>
         <w:tc>
           <w:tcPr>
-            <w:tcW w:type="dxa" w:w="3402"/>
+            <w:tcW w:type="dxa" w:w="4873"/>
             <w:vAlign w:val="center"/>
           </w:tcPr>
           <w:p>
@@ -3229,7 +3229,7 @@
         </w:tc>
         <w:tc>
           <w:tcPr>
-            <w:tcW w:type="dxa" w:w="5669"/>
+            <w:tcW w:type="dxa" w:w="4873"/>
             <w:vAlign w:val="center"/>
           </w:tcPr>
           <w:p>
@@ -3248,7 +3248,7 @@
       <w:tr>
         <w:tc>
           <w:tcPr>
-            <w:tcW w:type="dxa" w:w="3402"/>
+            <w:tcW w:type="dxa" w:w="4873"/>
             <w:vAlign w:val="center"/>
             <w:shd w:fill="F2F5F8" w:val="clear"/>
           </w:tcPr>
@@ -3266,7 +3266,7 @@
         </w:tc>
         <w:tc>
           <w:tcPr>
-            <w:tcW w:type="dxa" w:w="5669"/>
+            <w:tcW w:type="dxa" w:w="4873"/>
             <w:vAlign w:val="center"/>
             <w:shd w:fill="F2F5F8" w:val="clear"/>
           </w:tcPr>
@@ -3286,7 +3286,7 @@
       <w:tr>
         <w:tc>
           <w:tcPr>
-            <w:tcW w:type="dxa" w:w="3402"/>
+            <w:tcW w:type="dxa" w:w="4873"/>
             <w:vAlign w:val="center"/>
           </w:tcPr>
           <w:p>
@@ -3303,7 +3303,7 @@
         </w:tc>
         <w:tc>
           <w:tcPr>
-            <w:tcW w:type="dxa" w:w="5669"/>
+            <w:tcW w:type="dxa" w:w="4873"/>
             <w:vAlign w:val="center"/>
           </w:tcPr>
           <w:p>
@@ -3322,7 +3322,7 @@
       <w:tr>
         <w:tc>
           <w:tcPr>
-            <w:tcW w:type="dxa" w:w="3402"/>
+            <w:tcW w:type="dxa" w:w="4873"/>
             <w:vAlign w:val="center"/>
             <w:shd w:fill="F2F5F8" w:val="clear"/>
           </w:tcPr>
@@ -3340,7 +3340,7 @@
         </w:tc>
         <w:tc>
           <w:tcPr>
-            <w:tcW w:type="dxa" w:w="5669"/>
+            <w:tcW w:type="dxa" w:w="4873"/>
             <w:vAlign w:val="center"/>
             <w:shd w:fill="F2F5F8" w:val="clear"/>
           </w:tcPr>
@@ -3369,7 +3369,7 @@
           <w:b w:val="0"/>
           <w:sz w:val="22"/>
         </w:rPr>
-        <w:t>Not: Min tutar 0 görülen satırlar validasyon kuralında (tutar &gt; 0) reddedilmeli veya iş kuralına göre ayrıştırılmalıdır.</w:t>
+        <w:t>Not: Min tutar 0 görülen satırlar validasyon kuralında (tutar &gt; 0) reddedilmeli.</w:t>
       </w:r>
     </w:p>
     <w:p>
@@ -3400,7 +3400,7 @@
       <w:tr>
         <w:tc>
           <w:tcPr>
-            <w:tcW w:type="dxa" w:w="567"/>
+            <w:tcW w:type="dxa" w:w="1949"/>
             <w:vAlign w:val="center"/>
             <w:shd w:fill="1F3A5F" w:val="clear"/>
           </w:tcPr>
@@ -3419,7 +3419,7 @@
         </w:tc>
         <w:tc>
           <w:tcPr>
-            <w:tcW w:type="dxa" w:w="1984"/>
+            <w:tcW w:type="dxa" w:w="1949"/>
             <w:vAlign w:val="center"/>
             <w:shd w:fill="1F3A5F" w:val="clear"/>
           </w:tcPr>
@@ -3438,7 +3438,7 @@
         </w:tc>
         <w:tc>
           <w:tcPr>
-            <w:tcW w:type="dxa" w:w="1417"/>
+            <w:tcW w:type="dxa" w:w="1949"/>
             <w:vAlign w:val="center"/>
             <w:shd w:fill="1F3A5F" w:val="clear"/>
           </w:tcPr>
@@ -3457,7 +3457,7 @@
         </w:tc>
         <w:tc>
           <w:tcPr>
-            <w:tcW w:type="dxa" w:w="2551"/>
+            <w:tcW w:type="dxa" w:w="1949"/>
             <w:vAlign w:val="center"/>
             <w:shd w:fill="1F3A5F" w:val="clear"/>
           </w:tcPr>
@@ -3476,7 +3476,7 @@
         </w:tc>
         <w:tc>
           <w:tcPr>
-            <w:tcW w:type="dxa" w:w="2551"/>
+            <w:tcW w:type="dxa" w:w="1949"/>
             <w:vAlign w:val="center"/>
             <w:shd w:fill="1F3A5F" w:val="clear"/>
           </w:tcPr>
@@ -3497,7 +3497,7 @@
       <w:tr>
         <w:tc>
           <w:tcPr>
-            <w:tcW w:type="dxa" w:w="567"/>
+            <w:tcW w:type="dxa" w:w="1949"/>
             <w:vAlign w:val="center"/>
           </w:tcPr>
           <w:p>
@@ -3514,7 +3514,7 @@
         </w:tc>
         <w:tc>
           <w:tcPr>
-            <w:tcW w:type="dxa" w:w="1984"/>
+            <w:tcW w:type="dxa" w:w="1949"/>
             <w:vAlign w:val="center"/>
           </w:tcPr>
           <w:p>
@@ -3531,7 +3531,7 @@
         </w:tc>
         <w:tc>
           <w:tcPr>
-            <w:tcW w:type="dxa" w:w="1417"/>
+            <w:tcW w:type="dxa" w:w="1949"/>
             <w:vAlign w:val="center"/>
           </w:tcPr>
           <w:p>
@@ -3548,7 +3548,7 @@
         </w:tc>
         <w:tc>
           <w:tcPr>
-            <w:tcW w:type="dxa" w:w="2551"/>
+            <w:tcW w:type="dxa" w:w="1949"/>
             <w:vAlign w:val="center"/>
           </w:tcPr>
           <w:p>
@@ -3565,7 +3565,7 @@
         </w:tc>
         <w:tc>
           <w:tcPr>
-            <w:tcW w:type="dxa" w:w="2551"/>
+            <w:tcW w:type="dxa" w:w="1949"/>
             <w:vAlign w:val="center"/>
           </w:tcPr>
           <w:p>
@@ -3584,7 +3584,7 @@
       <w:tr>
         <w:tc>
           <w:tcPr>
-            <w:tcW w:type="dxa" w:w="567"/>
+            <w:tcW w:type="dxa" w:w="1949"/>
             <w:vAlign w:val="center"/>
             <w:shd w:fill="F2F5F8" w:val="clear"/>
           </w:tcPr>
@@ -3602,7 +3602,7 @@
         </w:tc>
         <w:tc>
           <w:tcPr>
-            <w:tcW w:type="dxa" w:w="1984"/>
+            <w:tcW w:type="dxa" w:w="1949"/>
             <w:vAlign w:val="center"/>
             <w:shd w:fill="F2F5F8" w:val="clear"/>
           </w:tcPr>
@@ -3620,7 +3620,7 @@
         </w:tc>
         <w:tc>
           <w:tcPr>
-            <w:tcW w:type="dxa" w:w="1417"/>
+            <w:tcW w:type="dxa" w:w="1949"/>
             <w:vAlign w:val="center"/>
             <w:shd w:fill="F2F5F8" w:val="clear"/>
           </w:tcPr>
@@ -3638,7 +3638,7 @@
         </w:tc>
         <w:tc>
           <w:tcPr>
-            <w:tcW w:type="dxa" w:w="2551"/>
+            <w:tcW w:type="dxa" w:w="1949"/>
             <w:vAlign w:val="center"/>
             <w:shd w:fill="F2F5F8" w:val="clear"/>
           </w:tcPr>
@@ -3656,7 +3656,7 @@
         </w:tc>
         <w:tc>
           <w:tcPr>
-            <w:tcW w:type="dxa" w:w="2551"/>
+            <w:tcW w:type="dxa" w:w="1949"/>
             <w:vAlign w:val="center"/>
             <w:shd w:fill="F2F5F8" w:val="clear"/>
           </w:tcPr>
@@ -3676,7 +3676,7 @@
       <w:tr>
         <w:tc>
           <w:tcPr>
-            <w:tcW w:type="dxa" w:w="567"/>
+            <w:tcW w:type="dxa" w:w="1949"/>
             <w:vAlign w:val="center"/>
           </w:tcPr>
           <w:p>
@@ -3693,7 +3693,7 @@
         </w:tc>
         <w:tc>
           <w:tcPr>
-            <w:tcW w:type="dxa" w:w="1984"/>
+            <w:tcW w:type="dxa" w:w="1949"/>
             <w:vAlign w:val="center"/>
           </w:tcPr>
           <w:p>
@@ -3710,7 +3710,7 @@
         </w:tc>
         <w:tc>
           <w:tcPr>
-            <w:tcW w:type="dxa" w:w="1417"/>
+            <w:tcW w:type="dxa" w:w="1949"/>
             <w:vAlign w:val="center"/>
           </w:tcPr>
           <w:p>
@@ -3727,7 +3727,7 @@
         </w:tc>
         <w:tc>
           <w:tcPr>
-            <w:tcW w:type="dxa" w:w="2551"/>
+            <w:tcW w:type="dxa" w:w="1949"/>
             <w:vAlign w:val="center"/>
           </w:tcPr>
           <w:p>
@@ -3744,7 +3744,7 @@
         </w:tc>
         <w:tc>
           <w:tcPr>
-            <w:tcW w:type="dxa" w:w="2551"/>
+            <w:tcW w:type="dxa" w:w="1949"/>
             <w:vAlign w:val="center"/>
           </w:tcPr>
           <w:p>
@@ -3763,7 +3763,7 @@
       <w:tr>
         <w:tc>
           <w:tcPr>
-            <w:tcW w:type="dxa" w:w="567"/>
+            <w:tcW w:type="dxa" w:w="1949"/>
             <w:vAlign w:val="center"/>
             <w:shd w:fill="F2F5F8" w:val="clear"/>
           </w:tcPr>
@@ -3781,7 +3781,7 @@
         </w:tc>
         <w:tc>
           <w:tcPr>
-            <w:tcW w:type="dxa" w:w="1984"/>
+            <w:tcW w:type="dxa" w:w="1949"/>
             <w:vAlign w:val="center"/>
             <w:shd w:fill="F2F5F8" w:val="clear"/>
           </w:tcPr>
@@ -3799,7 +3799,7 @@
         </w:tc>
         <w:tc>
           <w:tcPr>
-            <w:tcW w:type="dxa" w:w="1417"/>
+            <w:tcW w:type="dxa" w:w="1949"/>
             <w:vAlign w:val="center"/>
             <w:shd w:fill="F2F5F8" w:val="clear"/>
           </w:tcPr>
@@ -3817,7 +3817,7 @@
         </w:tc>
         <w:tc>
           <w:tcPr>
-            <w:tcW w:type="dxa" w:w="2551"/>
+            <w:tcW w:type="dxa" w:w="1949"/>
             <w:vAlign w:val="center"/>
             <w:shd w:fill="F2F5F8" w:val="clear"/>
           </w:tcPr>
@@ -3835,7 +3835,7 @@
         </w:tc>
         <w:tc>
           <w:tcPr>
-            <w:tcW w:type="dxa" w:w="2551"/>
+            <w:tcW w:type="dxa" w:w="1949"/>
             <w:vAlign w:val="center"/>
             <w:shd w:fill="F2F5F8" w:val="clear"/>
           </w:tcPr>
@@ -3855,7 +3855,7 @@
       <w:tr>
         <w:tc>
           <w:tcPr>
-            <w:tcW w:type="dxa" w:w="567"/>
+            <w:tcW w:type="dxa" w:w="1949"/>
             <w:vAlign w:val="center"/>
           </w:tcPr>
           <w:p>
@@ -3872,7 +3872,7 @@
         </w:tc>
         <w:tc>
           <w:tcPr>
-            <w:tcW w:type="dxa" w:w="1984"/>
+            <w:tcW w:type="dxa" w:w="1949"/>
             <w:vAlign w:val="center"/>
           </w:tcPr>
           <w:p>
@@ -3889,7 +3889,7 @@
         </w:tc>
         <w:tc>
           <w:tcPr>
-            <w:tcW w:type="dxa" w:w="1417"/>
+            <w:tcW w:type="dxa" w:w="1949"/>
             <w:vAlign w:val="center"/>
           </w:tcPr>
           <w:p>
@@ -3906,7 +3906,7 @@
         </w:tc>
         <w:tc>
           <w:tcPr>
-            <w:tcW w:type="dxa" w:w="2551"/>
+            <w:tcW w:type="dxa" w:w="1949"/>
             <w:vAlign w:val="center"/>
           </w:tcPr>
           <w:p>
@@ -3923,7 +3923,7 @@
         </w:tc>
         <w:tc>
           <w:tcPr>
-            <w:tcW w:type="dxa" w:w="2551"/>
+            <w:tcW w:type="dxa" w:w="1949"/>
             <w:vAlign w:val="center"/>
           </w:tcPr>
           <w:p>
@@ -3960,7 +3960,7 @@
         <w:rPr>
           <w:color w:val="1F3A5F"/>
         </w:rPr>
-        <w:t>7.1 Önerilen Veri Modeli (Oracle EBS Custom Schema)</w:t>
+        <w:t>7.1 Önerilen Veri Modeli</w:t>
       </w:r>
     </w:p>
     <w:tbl>
@@ -3978,7 +3978,7 @@
       <w:tr>
         <w:tc>
           <w:tcPr>
-            <w:tcW w:type="dxa" w:w="2268"/>
+            <w:tcW w:type="dxa" w:w="3249"/>
             <w:vAlign w:val="center"/>
             <w:shd w:fill="1F3A5F" w:val="clear"/>
           </w:tcPr>
@@ -3997,7 +3997,7 @@
         </w:tc>
         <w:tc>
           <w:tcPr>
-            <w:tcW w:type="dxa" w:w="2551"/>
+            <w:tcW w:type="dxa" w:w="3249"/>
             <w:vAlign w:val="center"/>
             <w:shd w:fill="1F3A5F" w:val="clear"/>
           </w:tcPr>
@@ -4016,7 +4016,7 @@
         </w:tc>
         <w:tc>
           <w:tcPr>
-            <w:tcW w:type="dxa" w:w="4252"/>
+            <w:tcW w:type="dxa" w:w="3249"/>
             <w:vAlign w:val="center"/>
             <w:shd w:fill="1F3A5F" w:val="clear"/>
           </w:tcPr>
@@ -4037,7 +4037,7 @@
       <w:tr>
         <w:tc>
           <w:tcPr>
-            <w:tcW w:type="dxa" w:w="2268"/>
+            <w:tcW w:type="dxa" w:w="3249"/>
             <w:vAlign w:val="center"/>
           </w:tcPr>
           <w:p>
@@ -4054,7 +4054,7 @@
         </w:tc>
         <w:tc>
           <w:tcPr>
-            <w:tcW w:type="dxa" w:w="2551"/>
+            <w:tcW w:type="dxa" w:w="3249"/>
             <w:vAlign w:val="center"/>
           </w:tcPr>
           <w:p>
@@ -4071,7 +4071,7 @@
         </w:tc>
         <w:tc>
           <w:tcPr>
-            <w:tcW w:type="dxa" w:w="4252"/>
+            <w:tcW w:type="dxa" w:w="3249"/>
             <w:vAlign w:val="center"/>
           </w:tcPr>
           <w:p>
@@ -4090,7 +4090,7 @@
       <w:tr>
         <w:tc>
           <w:tcPr>
-            <w:tcW w:type="dxa" w:w="2268"/>
+            <w:tcW w:type="dxa" w:w="3249"/>
             <w:vAlign w:val="center"/>
             <w:shd w:fill="F2F5F8" w:val="clear"/>
           </w:tcPr>
@@ -4108,7 +4108,7 @@
         </w:tc>
         <w:tc>
           <w:tcPr>
-            <w:tcW w:type="dxa" w:w="2551"/>
+            <w:tcW w:type="dxa" w:w="3249"/>
             <w:vAlign w:val="center"/>
             <w:shd w:fill="F2F5F8" w:val="clear"/>
           </w:tcPr>
@@ -4126,7 +4126,7 @@
         </w:tc>
         <w:tc>
           <w:tcPr>
-            <w:tcW w:type="dxa" w:w="4252"/>
+            <w:tcW w:type="dxa" w:w="3249"/>
             <w:vAlign w:val="center"/>
             <w:shd w:fill="F2F5F8" w:val="clear"/>
           </w:tcPr>
@@ -4146,7 +4146,7 @@
       <w:tr>
         <w:tc>
           <w:tcPr>
-            <w:tcW w:type="dxa" w:w="2268"/>
+            <w:tcW w:type="dxa" w:w="3249"/>
             <w:vAlign w:val="center"/>
           </w:tcPr>
           <w:p>
@@ -4163,7 +4163,7 @@
         </w:tc>
         <w:tc>
           <w:tcPr>
-            <w:tcW w:type="dxa" w:w="2551"/>
+            <w:tcW w:type="dxa" w:w="3249"/>
             <w:vAlign w:val="center"/>
           </w:tcPr>
           <w:p>
@@ -4180,7 +4180,7 @@
         </w:tc>
         <w:tc>
           <w:tcPr>
-            <w:tcW w:type="dxa" w:w="4252"/>
+            <w:tcW w:type="dxa" w:w="3249"/>
             <w:vAlign w:val="center"/>
           </w:tcPr>
           <w:p>
@@ -4199,7 +4199,7 @@
       <w:tr>
         <w:tc>
           <w:tcPr>
-            <w:tcW w:type="dxa" w:w="2268"/>
+            <w:tcW w:type="dxa" w:w="3249"/>
             <w:vAlign w:val="center"/>
             <w:shd w:fill="F2F5F8" w:val="clear"/>
           </w:tcPr>
@@ -4217,7 +4217,7 @@
         </w:tc>
         <w:tc>
           <w:tcPr>
-            <w:tcW w:type="dxa" w:w="2551"/>
+            <w:tcW w:type="dxa" w:w="3249"/>
             <w:vAlign w:val="center"/>
             <w:shd w:fill="F2F5F8" w:val="clear"/>
           </w:tcPr>
@@ -4235,7 +4235,7 @@
         </w:tc>
         <w:tc>
           <w:tcPr>
-            <w:tcW w:type="dxa" w:w="4252"/>
+            <w:tcW w:type="dxa" w:w="3249"/>
             <w:vAlign w:val="center"/>
             <w:shd w:fill="F2F5F8" w:val="clear"/>
           </w:tcPr>
@@ -4255,7 +4255,7 @@
       <w:tr>
         <w:tc>
           <w:tcPr>
-            <w:tcW w:type="dxa" w:w="2268"/>
+            <w:tcW w:type="dxa" w:w="3249"/>
             <w:vAlign w:val="center"/>
           </w:tcPr>
           <w:p>
@@ -4272,7 +4272,7 @@
         </w:tc>
         <w:tc>
           <w:tcPr>
-            <w:tcW w:type="dxa" w:w="2551"/>
+            <w:tcW w:type="dxa" w:w="3249"/>
             <w:vAlign w:val="center"/>
           </w:tcPr>
           <w:p>
@@ -4289,7 +4289,7 @@
         </w:tc>
         <w:tc>
           <w:tcPr>
-            <w:tcW w:type="dxa" w:w="4252"/>
+            <w:tcW w:type="dxa" w:w="3249"/>
             <w:vAlign w:val="center"/>
           </w:tcPr>
           <w:p>
@@ -4308,7 +4308,7 @@
       <w:tr>
         <w:tc>
           <w:tcPr>
-            <w:tcW w:type="dxa" w:w="2268"/>
+            <w:tcW w:type="dxa" w:w="3249"/>
             <w:vAlign w:val="center"/>
             <w:shd w:fill="F2F5F8" w:val="clear"/>
           </w:tcPr>
@@ -4326,7 +4326,7 @@
         </w:tc>
         <w:tc>
           <w:tcPr>
-            <w:tcW w:type="dxa" w:w="2551"/>
+            <w:tcW w:type="dxa" w:w="3249"/>
             <w:vAlign w:val="center"/>
             <w:shd w:fill="F2F5F8" w:val="clear"/>
           </w:tcPr>
@@ -4344,7 +4344,7 @@
         </w:tc>
         <w:tc>
           <w:tcPr>
-            <w:tcW w:type="dxa" w:w="4252"/>
+            <w:tcW w:type="dxa" w:w="3249"/>
             <w:vAlign w:val="center"/>
             <w:shd w:fill="F2F5F8" w:val="clear"/>
           </w:tcPr>
@@ -4364,7 +4364,7 @@
       <w:tr>
         <w:tc>
           <w:tcPr>
-            <w:tcW w:type="dxa" w:w="2268"/>
+            <w:tcW w:type="dxa" w:w="3249"/>
             <w:vAlign w:val="center"/>
           </w:tcPr>
           <w:p>
@@ -4381,7 +4381,7 @@
         </w:tc>
         <w:tc>
           <w:tcPr>
-            <w:tcW w:type="dxa" w:w="2551"/>
+            <w:tcW w:type="dxa" w:w="3249"/>
             <w:vAlign w:val="center"/>
           </w:tcPr>
           <w:p>
@@ -4398,7 +4398,7 @@
         </w:tc>
         <w:tc>
           <w:tcPr>
-            <w:tcW w:type="dxa" w:w="4252"/>
+            <w:tcW w:type="dxa" w:w="3249"/>
             <w:vAlign w:val="center"/>
           </w:tcPr>
           <w:p>
@@ -4417,7 +4417,7 @@
       <w:tr>
         <w:tc>
           <w:tcPr>
-            <w:tcW w:type="dxa" w:w="2268"/>
+            <w:tcW w:type="dxa" w:w="3249"/>
             <w:vAlign w:val="center"/>
             <w:shd w:fill="F2F5F8" w:val="clear"/>
           </w:tcPr>
@@ -4435,7 +4435,7 @@
         </w:tc>
         <w:tc>
           <w:tcPr>
-            <w:tcW w:type="dxa" w:w="2551"/>
+            <w:tcW w:type="dxa" w:w="3249"/>
             <w:vAlign w:val="center"/>
             <w:shd w:fill="F2F5F8" w:val="clear"/>
           </w:tcPr>
@@ -4453,7 +4453,7 @@
         </w:tc>
         <w:tc>
           <w:tcPr>
-            <w:tcW w:type="dxa" w:w="4252"/>
+            <w:tcW w:type="dxa" w:w="3249"/>
             <w:vAlign w:val="center"/>
             <w:shd w:fill="F2F5F8" w:val="clear"/>
           </w:tcPr>
@@ -4473,7 +4473,7 @@
       <w:tr>
         <w:tc>
           <w:tcPr>
-            <w:tcW w:type="dxa" w:w="2268"/>
+            <w:tcW w:type="dxa" w:w="3249"/>
             <w:vAlign w:val="center"/>
           </w:tcPr>
           <w:p>
@@ -4490,7 +4490,7 @@
         </w:tc>
         <w:tc>
           <w:tcPr>
-            <w:tcW w:type="dxa" w:w="2551"/>
+            <w:tcW w:type="dxa" w:w="3249"/>
             <w:vAlign w:val="center"/>
           </w:tcPr>
           <w:p>
@@ -4507,7 +4507,7 @@
         </w:tc>
         <w:tc>
           <w:tcPr>
-            <w:tcW w:type="dxa" w:w="4252"/>
+            <w:tcW w:type="dxa" w:w="3249"/>
             <w:vAlign w:val="center"/>
           </w:tcPr>
           <w:p>
@@ -4526,7 +4526,7 @@
       <w:tr>
         <w:tc>
           <w:tcPr>
-            <w:tcW w:type="dxa" w:w="2268"/>
+            <w:tcW w:type="dxa" w:w="3249"/>
             <w:vAlign w:val="center"/>
             <w:shd w:fill="F2F5F8" w:val="clear"/>
           </w:tcPr>
@@ -4544,7 +4544,7 @@
         </w:tc>
         <w:tc>
           <w:tcPr>
-            <w:tcW w:type="dxa" w:w="2551"/>
+            <w:tcW w:type="dxa" w:w="3249"/>
             <w:vAlign w:val="center"/>
             <w:shd w:fill="F2F5F8" w:val="clear"/>
           </w:tcPr>
@@ -4562,7 +4562,7 @@
         </w:tc>
         <w:tc>
           <w:tcPr>
-            <w:tcW w:type="dxa" w:w="4252"/>
+            <w:tcW w:type="dxa" w:w="3249"/>
             <w:vAlign w:val="center"/>
             <w:shd w:fill="F2F5F8" w:val="clear"/>
           </w:tcPr>
@@ -4589,7 +4589,7 @@
         <w:rPr>
           <w:color w:val="1F3A5F"/>
         </w:rPr>
-        <w:t>7.2 136 Hesap Mantığı (Muhasebe)</w:t>
+        <w:t>7.2 136 Hesap Mantığı</w:t>
       </w:r>
     </w:p>
     <w:p>
@@ -4641,7 +4641,7 @@
           <w:b w:val="0"/>
           <w:sz w:val="22"/>
         </w:rPr>
-        <w:t>Kampanya sonu NTS kalan bakiye → Turkcell hesaplarına otomatik iade (Paycell iade servisi)</w:t>
+        <w:t>Kampanya sonu NTS kalan bakiye → Turkcell hesaplarına otomatik iade</w:t>
       </w:r>
     </w:p>
     <w:p>
@@ -4654,7 +4654,7 @@
           <w:b w:val="0"/>
           <w:sz w:val="22"/>
         </w:rPr>
-        <w:t>Segment detayları Ayşim Tuncer’den (kart bazlı + kampanya bazlı) alınacak; INVOICE_GROUP string’i buna göre üretilecek</w:t>
+        <w:t>Segment detayları Ayşim Tuncer’den alınacak; INVOICE_GROUP string’i buna göre üretilecek</w:t>
       </w:r>
     </w:p>
     <w:p>
@@ -4667,7 +4667,7 @@
           <w:b w:val="0"/>
           <w:sz w:val="22"/>
         </w:rPr>
-        <w:t>Örnek invoice group (şablondan): 01-136.01.01.01.01.003-0-0-KA52-0-0-0-0-0-0-0-0-0-0</w:t>
+        <w:t>Örnek invoice group: 01-136.01.01.01.01.003-0-0-KA52-0-0-0-0-0-0-0-0-0-0</w:t>
       </w:r>
     </w:p>
     <w:p>
@@ -4678,7 +4678,7 @@
         <w:rPr>
           <w:color w:val="1F3A5F"/>
         </w:rPr>
-        <w:t>7.3 ATF ve PO Otomasyonu (Oracle EBS)</w:t>
+        <w:t>7.3 ATF ve PO Otomasyonu</w:t>
       </w:r>
     </w:p>
     <w:p>
@@ -4691,7 +4691,7 @@
           <w:b w:val="0"/>
           <w:sz w:val="22"/>
         </w:rPr>
-        <w:t>Ayrı bir ödeme grubu (payment group / batch source) tanımlanır — diğer AP akışlarından izole</w:t>
+        <w:t>Ayrı bir ödeme grubu tanımlanır — diğer AP akışlarından izole</w:t>
       </w:r>
     </w:p>
     <w:p>
@@ -4704,7 +4704,7 @@
           <w:b w:val="0"/>
           <w:sz w:val="22"/>
         </w:rPr>
-        <w:t>ATF: marka/kampanya bazlı tek (veya marka kırılımlı) ödeme belgesi</w:t>
+        <w:t>ATF: marka/kampanya bazlı ödeme belgesi</w:t>
       </w:r>
     </w:p>
     <w:p>
@@ -4717,7 +4717,7 @@
           <w:b w:val="0"/>
           <w:sz w:val="22"/>
         </w:rPr>
-        <w:t>PO: bayi (VENDOR_ID + VENDOR_SITE_ID + CODE_COLLABORATEUR) bazında satır/header üretimi</w:t>
+        <w:t>PO: bayi (VENDOR_ID + VENDOR_SITE_ID + CODE_COLLABORATEUR) bazında üretim</w:t>
       </w:r>
     </w:p>
     <w:p>
@@ -4743,7 +4743,7 @@
           <w:b w:val="0"/>
           <w:sz w:val="22"/>
         </w:rPr>
-        <w:t>API adayları: PO_HEADERS_INTERFACE / PO_LINES_INTERFACE + Purchasing Import Concurrent; veya custom wrapper package XXBOF_PO_PKG</w:t>
+        <w:t>API adayları: PO_HEADERS_INTERFACE / PO_LINES_INTERFACE + Purchasing Import; veya XXBOF_PO_PKG</w:t>
       </w:r>
     </w:p>
     <w:p>
@@ -4756,7 +4756,7 @@
           <w:b w:val="0"/>
           <w:sz w:val="22"/>
         </w:rPr>
-        <w:t>Onay: ONAY_HIYERARSISI kodu AME attribute / existing hierarchy’ye map edilir</w:t>
+        <w:t>Onay: ONAY_HIYERARSISI kodu AME / existing hierarchy’ye map edilir</w:t>
       </w:r>
     </w:p>
     <w:p>
@@ -4786,7 +4786,7 @@
       <w:tr>
         <w:tc>
           <w:tcPr>
-            <w:tcW w:type="dxa" w:w="2268"/>
+            <w:tcW w:type="dxa" w:w="2436"/>
             <w:vAlign w:val="center"/>
             <w:shd w:fill="1F3A5F" w:val="clear"/>
           </w:tcPr>
@@ -4805,7 +4805,7 @@
         </w:tc>
         <w:tc>
           <w:tcPr>
-            <w:tcW w:type="dxa" w:w="1984"/>
+            <w:tcW w:type="dxa" w:w="2436"/>
             <w:vAlign w:val="center"/>
             <w:shd w:fill="1F3A5F" w:val="clear"/>
           </w:tcPr>
@@ -4824,7 +4824,7 @@
         </w:tc>
         <w:tc>
           <w:tcPr>
-            <w:tcW w:type="dxa" w:w="1984"/>
+            <w:tcW w:type="dxa" w:w="2436"/>
             <w:vAlign w:val="center"/>
             <w:shd w:fill="1F3A5F" w:val="clear"/>
           </w:tcPr>
@@ -4843,7 +4843,7 @@
         </w:tc>
         <w:tc>
           <w:tcPr>
-            <w:tcW w:type="dxa" w:w="2835"/>
+            <w:tcW w:type="dxa" w:w="2436"/>
             <w:vAlign w:val="center"/>
             <w:shd w:fill="1F3A5F" w:val="clear"/>
           </w:tcPr>
@@ -4864,7 +4864,7 @@
       <w:tr>
         <w:tc>
           <w:tcPr>
-            <w:tcW w:type="dxa" w:w="2268"/>
+            <w:tcW w:type="dxa" w:w="2436"/>
             <w:vAlign w:val="center"/>
           </w:tcPr>
           <w:p>
@@ -4881,7 +4881,7 @@
         </w:tc>
         <w:tc>
           <w:tcPr>
-            <w:tcW w:type="dxa" w:w="1984"/>
+            <w:tcW w:type="dxa" w:w="2436"/>
             <w:vAlign w:val="center"/>
           </w:tcPr>
           <w:p>
@@ -4898,7 +4898,7 @@
         </w:tc>
         <w:tc>
           <w:tcPr>
-            <w:tcW w:type="dxa" w:w="1984"/>
+            <w:tcW w:type="dxa" w:w="2436"/>
             <w:vAlign w:val="center"/>
           </w:tcPr>
           <w:p>
@@ -4915,7 +4915,7 @@
         </w:tc>
         <w:tc>
           <w:tcPr>
-            <w:tcW w:type="dxa" w:w="2835"/>
+            <w:tcW w:type="dxa" w:w="2436"/>
             <w:vAlign w:val="center"/>
           </w:tcPr>
           <w:p>
@@ -4934,7 +4934,7 @@
       <w:tr>
         <w:tc>
           <w:tcPr>
-            <w:tcW w:type="dxa" w:w="2268"/>
+            <w:tcW w:type="dxa" w:w="2436"/>
             <w:vAlign w:val="center"/>
             <w:shd w:fill="F2F5F8" w:val="clear"/>
           </w:tcPr>
@@ -4952,7 +4952,7 @@
         </w:tc>
         <w:tc>
           <w:tcPr>
-            <w:tcW w:type="dxa" w:w="1984"/>
+            <w:tcW w:type="dxa" w:w="2436"/>
             <w:vAlign w:val="center"/>
             <w:shd w:fill="F2F5F8" w:val="clear"/>
           </w:tcPr>
@@ -4970,7 +4970,7 @@
         </w:tc>
         <w:tc>
           <w:tcPr>
-            <w:tcW w:type="dxa" w:w="1984"/>
+            <w:tcW w:type="dxa" w:w="2436"/>
             <w:vAlign w:val="center"/>
             <w:shd w:fill="F2F5F8" w:val="clear"/>
           </w:tcPr>
@@ -4988,7 +4988,7 @@
         </w:tc>
         <w:tc>
           <w:tcPr>
-            <w:tcW w:type="dxa" w:w="2835"/>
+            <w:tcW w:type="dxa" w:w="2436"/>
             <w:vAlign w:val="center"/>
             <w:shd w:fill="F2F5F8" w:val="clear"/>
           </w:tcPr>
@@ -5008,7 +5008,7 @@
       <w:tr>
         <w:tc>
           <w:tcPr>
-            <w:tcW w:type="dxa" w:w="2268"/>
+            <w:tcW w:type="dxa" w:w="2436"/>
             <w:vAlign w:val="center"/>
           </w:tcPr>
           <w:p>
@@ -5025,7 +5025,7 @@
         </w:tc>
         <w:tc>
           <w:tcPr>
-            <w:tcW w:type="dxa" w:w="1984"/>
+            <w:tcW w:type="dxa" w:w="2436"/>
             <w:vAlign w:val="center"/>
           </w:tcPr>
           <w:p>
@@ -5042,7 +5042,7 @@
         </w:tc>
         <w:tc>
           <w:tcPr>
-            <w:tcW w:type="dxa" w:w="1984"/>
+            <w:tcW w:type="dxa" w:w="2436"/>
             <w:vAlign w:val="center"/>
           </w:tcPr>
           <w:p>
@@ -5059,7 +5059,7 @@
         </w:tc>
         <w:tc>
           <w:tcPr>
-            <w:tcW w:type="dxa" w:w="2835"/>
+            <w:tcW w:type="dxa" w:w="2436"/>
             <w:vAlign w:val="center"/>
           </w:tcPr>
           <w:p>
@@ -5078,7 +5078,7 @@
       <w:tr>
         <w:tc>
           <w:tcPr>
-            <w:tcW w:type="dxa" w:w="2268"/>
+            <w:tcW w:type="dxa" w:w="2436"/>
             <w:vAlign w:val="center"/>
             <w:shd w:fill="F2F5F8" w:val="clear"/>
           </w:tcPr>
@@ -5096,7 +5096,7 @@
         </w:tc>
         <w:tc>
           <w:tcPr>
-            <w:tcW w:type="dxa" w:w="1984"/>
+            <w:tcW w:type="dxa" w:w="2436"/>
             <w:vAlign w:val="center"/>
             <w:shd w:fill="F2F5F8" w:val="clear"/>
           </w:tcPr>
@@ -5114,7 +5114,7 @@
         </w:tc>
         <w:tc>
           <w:tcPr>
-            <w:tcW w:type="dxa" w:w="1984"/>
+            <w:tcW w:type="dxa" w:w="2436"/>
             <w:vAlign w:val="center"/>
             <w:shd w:fill="F2F5F8" w:val="clear"/>
           </w:tcPr>
@@ -5132,7 +5132,7 @@
         </w:tc>
         <w:tc>
           <w:tcPr>
-            <w:tcW w:type="dxa" w:w="2835"/>
+            <w:tcW w:type="dxa" w:w="2436"/>
             <w:vAlign w:val="center"/>
             <w:shd w:fill="F2F5F8" w:val="clear"/>
           </w:tcPr>
@@ -5152,7 +5152,7 @@
       <w:tr>
         <w:tc>
           <w:tcPr>
-            <w:tcW w:type="dxa" w:w="2268"/>
+            <w:tcW w:type="dxa" w:w="2436"/>
             <w:vAlign w:val="center"/>
           </w:tcPr>
           <w:p>
@@ -5169,7 +5169,7 @@
         </w:tc>
         <w:tc>
           <w:tcPr>
-            <w:tcW w:type="dxa" w:w="1984"/>
+            <w:tcW w:type="dxa" w:w="2436"/>
             <w:vAlign w:val="center"/>
           </w:tcPr>
           <w:p>
@@ -5186,7 +5186,7 @@
         </w:tc>
         <w:tc>
           <w:tcPr>
-            <w:tcW w:type="dxa" w:w="1984"/>
+            <w:tcW w:type="dxa" w:w="2436"/>
             <w:vAlign w:val="center"/>
           </w:tcPr>
           <w:p>
@@ -5203,7 +5203,7 @@
         </w:tc>
         <w:tc>
           <w:tcPr>
-            <w:tcW w:type="dxa" w:w="2835"/>
+            <w:tcW w:type="dxa" w:w="2436"/>
             <w:vAlign w:val="center"/>
           </w:tcPr>
           <w:p>
@@ -5231,7 +5231,7 @@
           <w:b w:val="0"/>
           <w:sz w:val="22"/>
         </w:rPr>
-        <w:t>Teknik notlar: timeout/retry politikası, idempotency key (campaign_id + tckn + amount + event_date), PII maskeleme (TCKN/kart log’larda maskeli), audit trail zorunlu.</w:t>
+        <w:t>Teknik notlar: timeout/retry, idempotency key (campaign_id + tckn + amount + event_date), PII maskeleme, audit trail zorunlu.</w:t>
       </w:r>
     </w:p>
     <w:p>
@@ -5255,7 +5255,7 @@
           <w:b w:val="0"/>
           <w:sz w:val="22"/>
         </w:rPr>
-        <w:t>Personel aktif mi? (IDM/BYS)</w:t>
+        <w:t>Personel aktif mi?</w:t>
       </w:r>
     </w:p>
     <w:p>
@@ -5386,7 +5386,7 @@
       <w:tr>
         <w:tc>
           <w:tcPr>
-            <w:tcW w:type="dxa" w:w="2268"/>
+            <w:tcW w:type="dxa" w:w="3249"/>
             <w:vAlign w:val="center"/>
             <w:shd w:fill="1F3A5F" w:val="clear"/>
           </w:tcPr>
@@ -5405,7 +5405,7 @@
         </w:tc>
         <w:tc>
           <w:tcPr>
-            <w:tcW w:type="dxa" w:w="2551"/>
+            <w:tcW w:type="dxa" w:w="3249"/>
             <w:vAlign w:val="center"/>
             <w:shd w:fill="1F3A5F" w:val="clear"/>
           </w:tcPr>
@@ -5424,7 +5424,7 @@
         </w:tc>
         <w:tc>
           <w:tcPr>
-            <w:tcW w:type="dxa" w:w="4252"/>
+            <w:tcW w:type="dxa" w:w="3249"/>
             <w:vAlign w:val="center"/>
             <w:shd w:fill="1F3A5F" w:val="clear"/>
           </w:tcPr>
@@ -5445,7 +5445,7 @@
       <w:tr>
         <w:tc>
           <w:tcPr>
-            <w:tcW w:type="dxa" w:w="2268"/>
+            <w:tcW w:type="dxa" w:w="3249"/>
             <w:vAlign w:val="center"/>
           </w:tcPr>
           <w:p>
@@ -5462,7 +5462,7 @@
         </w:tc>
         <w:tc>
           <w:tcPr>
-            <w:tcW w:type="dxa" w:w="2551"/>
+            <w:tcW w:type="dxa" w:w="3249"/>
             <w:vAlign w:val="center"/>
           </w:tcPr>
           <w:p>
@@ -5479,7 +5479,7 @@
         </w:tc>
         <w:tc>
           <w:tcPr>
-            <w:tcW w:type="dxa" w:w="4252"/>
+            <w:tcW w:type="dxa" w:w="3249"/>
             <w:vAlign w:val="center"/>
           </w:tcPr>
           <w:p>
@@ -5498,7 +5498,7 @@
       <w:tr>
         <w:tc>
           <w:tcPr>
-            <w:tcW w:type="dxa" w:w="2268"/>
+            <w:tcW w:type="dxa" w:w="3249"/>
             <w:vAlign w:val="center"/>
             <w:shd w:fill="F2F5F8" w:val="clear"/>
           </w:tcPr>
@@ -5516,7 +5516,7 @@
         </w:tc>
         <w:tc>
           <w:tcPr>
-            <w:tcW w:type="dxa" w:w="2551"/>
+            <w:tcW w:type="dxa" w:w="3249"/>
             <w:vAlign w:val="center"/>
             <w:shd w:fill="F2F5F8" w:val="clear"/>
           </w:tcPr>
@@ -5534,7 +5534,7 @@
         </w:tc>
         <w:tc>
           <w:tcPr>
-            <w:tcW w:type="dxa" w:w="4252"/>
+            <w:tcW w:type="dxa" w:w="3249"/>
             <w:vAlign w:val="center"/>
             <w:shd w:fill="F2F5F8" w:val="clear"/>
           </w:tcPr>
@@ -5554,7 +5554,7 @@
       <w:tr>
         <w:tc>
           <w:tcPr>
-            <w:tcW w:type="dxa" w:w="2268"/>
+            <w:tcW w:type="dxa" w:w="3249"/>
             <w:vAlign w:val="center"/>
           </w:tcPr>
           <w:p>
@@ -5571,7 +5571,7 @@
         </w:tc>
         <w:tc>
           <w:tcPr>
-            <w:tcW w:type="dxa" w:w="2551"/>
+            <w:tcW w:type="dxa" w:w="3249"/>
             <w:vAlign w:val="center"/>
           </w:tcPr>
           <w:p>
@@ -5588,7 +5588,7 @@
         </w:tc>
         <w:tc>
           <w:tcPr>
-            <w:tcW w:type="dxa" w:w="4252"/>
+            <w:tcW w:type="dxa" w:w="3249"/>
             <w:vAlign w:val="center"/>
           </w:tcPr>
           <w:p>
@@ -5607,7 +5607,7 @@
       <w:tr>
         <w:tc>
           <w:tcPr>
-            <w:tcW w:type="dxa" w:w="2268"/>
+            <w:tcW w:type="dxa" w:w="3249"/>
             <w:vAlign w:val="center"/>
             <w:shd w:fill="F2F5F8" w:val="clear"/>
           </w:tcPr>
@@ -5625,7 +5625,7 @@
         </w:tc>
         <w:tc>
           <w:tcPr>
-            <w:tcW w:type="dxa" w:w="2551"/>
+            <w:tcW w:type="dxa" w:w="3249"/>
             <w:vAlign w:val="center"/>
             <w:shd w:fill="F2F5F8" w:val="clear"/>
           </w:tcPr>
@@ -5643,7 +5643,7 @@
         </w:tc>
         <w:tc>
           <w:tcPr>
-            <w:tcW w:type="dxa" w:w="4252"/>
+            <w:tcW w:type="dxa" w:w="3249"/>
             <w:vAlign w:val="center"/>
             <w:shd w:fill="F2F5F8" w:val="clear"/>
           </w:tcPr>
@@ -5663,7 +5663,7 @@
       <w:tr>
         <w:tc>
           <w:tcPr>
-            <w:tcW w:type="dxa" w:w="2268"/>
+            <w:tcW w:type="dxa" w:w="3249"/>
             <w:vAlign w:val="center"/>
           </w:tcPr>
           <w:p>
@@ -5680,7 +5680,7 @@
         </w:tc>
         <w:tc>
           <w:tcPr>
-            <w:tcW w:type="dxa" w:w="2551"/>
+            <w:tcW w:type="dxa" w:w="3249"/>
             <w:vAlign w:val="center"/>
           </w:tcPr>
           <w:p>
@@ -5697,7 +5697,7 @@
         </w:tc>
         <w:tc>
           <w:tcPr>
-            <w:tcW w:type="dxa" w:w="4252"/>
+            <w:tcW w:type="dxa" w:w="3249"/>
             <w:vAlign w:val="center"/>
           </w:tcPr>
           <w:p>
@@ -5716,7 +5716,7 @@
       <w:tr>
         <w:tc>
           <w:tcPr>
-            <w:tcW w:type="dxa" w:w="2268"/>
+            <w:tcW w:type="dxa" w:w="3249"/>
             <w:vAlign w:val="center"/>
             <w:shd w:fill="F2F5F8" w:val="clear"/>
           </w:tcPr>
@@ -5734,7 +5734,7 @@
         </w:tc>
         <w:tc>
           <w:tcPr>
-            <w:tcW w:type="dxa" w:w="2551"/>
+            <w:tcW w:type="dxa" w:w="3249"/>
             <w:vAlign w:val="center"/>
             <w:shd w:fill="F2F5F8" w:val="clear"/>
           </w:tcPr>
@@ -5752,7 +5752,7 @@
         </w:tc>
         <w:tc>
           <w:tcPr>
-            <w:tcW w:type="dxa" w:w="4252"/>
+            <w:tcW w:type="dxa" w:w="3249"/>
             <w:vAlign w:val="center"/>
             <w:shd w:fill="F2F5F8" w:val="clear"/>
           </w:tcPr>
@@ -5772,7 +5772,7 @@
       <w:tr>
         <w:tc>
           <w:tcPr>
-            <w:tcW w:type="dxa" w:w="2268"/>
+            <w:tcW w:type="dxa" w:w="3249"/>
             <w:vAlign w:val="center"/>
           </w:tcPr>
           <w:p>
@@ -5789,7 +5789,7 @@
         </w:tc>
         <w:tc>
           <w:tcPr>
-            <w:tcW w:type="dxa" w:w="2551"/>
+            <w:tcW w:type="dxa" w:w="3249"/>
             <w:vAlign w:val="center"/>
           </w:tcPr>
           <w:p>
@@ -5806,7 +5806,7 @@
         </w:tc>
         <w:tc>
           <w:tcPr>
-            <w:tcW w:type="dxa" w:w="4252"/>
+            <w:tcW w:type="dxa" w:w="3249"/>
             <w:vAlign w:val="center"/>
           </w:tcPr>
           <w:p>
@@ -5825,7 +5825,7 @@
       <w:tr>
         <w:tc>
           <w:tcPr>
-            <w:tcW w:type="dxa" w:w="2268"/>
+            <w:tcW w:type="dxa" w:w="3249"/>
             <w:vAlign w:val="center"/>
             <w:shd w:fill="F2F5F8" w:val="clear"/>
           </w:tcPr>
@@ -5843,7 +5843,7 @@
         </w:tc>
         <w:tc>
           <w:tcPr>
-            <w:tcW w:type="dxa" w:w="2551"/>
+            <w:tcW w:type="dxa" w:w="3249"/>
             <w:vAlign w:val="center"/>
             <w:shd w:fill="F2F5F8" w:val="clear"/>
           </w:tcPr>
@@ -5861,7 +5861,7 @@
         </w:tc>
         <w:tc>
           <w:tcPr>
-            <w:tcW w:type="dxa" w:w="4252"/>
+            <w:tcW w:type="dxa" w:w="3249"/>
             <w:vAlign w:val="center"/>
             <w:shd w:fill="F2F5F8" w:val="clear"/>
           </w:tcPr>
@@ -5901,7 +5901,7 @@
           <w:b w:val="0"/>
           <w:sz w:val="22"/>
         </w:rPr>
-        <w:t>Maskeli kart numarası gönderimi (AD Checklist — Bilgi Güvenliği: Dolduruldu)</w:t>
+        <w:t>Maskeli kart numarası gönderimi</w:t>
       </w:r>
     </w:p>
     <w:p>
@@ -5964,7 +5964,7 @@
           <w:b w:val="0"/>
           <w:sz w:val="22"/>
         </w:rPr>
-        <w:t>Fazlar ardışık bağımlılıklarla ilerler; her fazın çıkış kriteri bir sonraki faza giriş koşuludur. Takvim günü tahmini verilmemiştir; kapsam teknik bileşen büyüklüğü ile ifade edilmiştir.</w:t>
+        <w:t>Fazlar ardışık bağımlılıklarla ilerler; her fazın çıkış kriteri bir sonraki faza giriş koşuludur.</w:t>
       </w:r>
     </w:p>
     <w:p>
@@ -6027,7 +6027,7 @@
           <w:b w:val="0"/>
           <w:sz w:val="22"/>
         </w:rPr>
-        <w:t>Onay hiyerarşi kodlarının tam listesi (339 ve eksikler) — iş birimleri + satın alma</w:t>
+        <w:t>Onay hiyerarşi kodlarının tam listesi (339 ve eksikler)</w:t>
       </w:r>
     </w:p>
     <w:p>
@@ -6053,7 +6053,7 @@
           <w:b w:val="0"/>
           <w:sz w:val="22"/>
         </w:rPr>
-        <w:t>Haftalık nakit akış onayı (Cüneyt Bey / Kamil Bey) ve Aralık çift gün takvimi</w:t>
+        <w:t>Haftalık nakit akış onayı ve Aralık çift gün takvimi</w:t>
       </w:r>
     </w:p>
     <w:p>
@@ -6142,7 +6142,7 @@
           <w:b w:val="0"/>
           <w:sz w:val="22"/>
         </w:rPr>
-        <w:t>Çıkış: Liste yüklenebilir; validasyon raporu üretilir (Paycell/BYS mock ile)</w:t>
+        <w:t>Çıkış: Liste yüklenebilir; validasyon raporu üretilir (mock ile)</w:t>
       </w:r>
     </w:p>
     <w:p>
@@ -6218,7 +6218,7 @@
           <w:b w:val="0"/>
           <w:sz w:val="22"/>
         </w:rPr>
-        <w:t>Çıkış: UAT ortamında örnek kampanya ile ATF+PO+136 borç oluşur</w:t>
+        <w:t>Çıkış: UAT’ta örnek kampanya ile ATF+PO+136 borç oluşur</w:t>
       </w:r>
     </w:p>
     <w:p>
@@ -6394,7 +6394,7 @@
           <w:b w:val="0"/>
           <w:sz w:val="22"/>
         </w:rPr>
-        <w:t>Cutover: paralel koşu (manuel template vs otomatik) bir ödeme döneminde</w:t>
+        <w:t>Cutover: paralel koşu (manuel template vs otomatik)</w:t>
       </w:r>
     </w:p>
     <w:p>
@@ -6435,7 +6435,7 @@
       <w:tr>
         <w:tc>
           <w:tcPr>
-            <w:tcW w:type="dxa" w:w="2835"/>
+            <w:tcW w:type="dxa" w:w="4873"/>
             <w:vAlign w:val="center"/>
             <w:shd w:fill="1F3A5F" w:val="clear"/>
           </w:tcPr>
@@ -6454,7 +6454,7 @@
         </w:tc>
         <w:tc>
           <w:tcPr>
-            <w:tcW w:type="dxa" w:w="6236"/>
+            <w:tcW w:type="dxa" w:w="4873"/>
             <w:vAlign w:val="center"/>
             <w:shd w:fill="1F3A5F" w:val="clear"/>
           </w:tcPr>
@@ -6475,7 +6475,7 @@
       <w:tr>
         <w:tc>
           <w:tcPr>
-            <w:tcW w:type="dxa" w:w="2835"/>
+            <w:tcW w:type="dxa" w:w="4873"/>
             <w:vAlign w:val="center"/>
           </w:tcPr>
           <w:p>
@@ -6492,7 +6492,7 @@
         </w:tc>
         <w:tc>
           <w:tcPr>
-            <w:tcW w:type="dxa" w:w="6236"/>
+            <w:tcW w:type="dxa" w:w="4873"/>
             <w:vAlign w:val="center"/>
           </w:tcPr>
           <w:p>
@@ -6511,7 +6511,7 @@
       <w:tr>
         <w:tc>
           <w:tcPr>
-            <w:tcW w:type="dxa" w:w="2835"/>
+            <w:tcW w:type="dxa" w:w="4873"/>
             <w:vAlign w:val="center"/>
             <w:shd w:fill="F2F5F8" w:val="clear"/>
           </w:tcPr>
@@ -6529,7 +6529,7 @@
         </w:tc>
         <w:tc>
           <w:tcPr>
-            <w:tcW w:type="dxa" w:w="6236"/>
+            <w:tcW w:type="dxa" w:w="4873"/>
             <w:vAlign w:val="center"/>
             <w:shd w:fill="F2F5F8" w:val="clear"/>
           </w:tcPr>
@@ -6549,7 +6549,7 @@
       <w:tr>
         <w:tc>
           <w:tcPr>
-            <w:tcW w:type="dxa" w:w="2835"/>
+            <w:tcW w:type="dxa" w:w="4873"/>
             <w:vAlign w:val="center"/>
           </w:tcPr>
           <w:p>
@@ -6566,7 +6566,7 @@
         </w:tc>
         <w:tc>
           <w:tcPr>
-            <w:tcW w:type="dxa" w:w="6236"/>
+            <w:tcW w:type="dxa" w:w="4873"/>
             <w:vAlign w:val="center"/>
           </w:tcPr>
           <w:p>
@@ -6585,7 +6585,7 @@
       <w:tr>
         <w:tc>
           <w:tcPr>
-            <w:tcW w:type="dxa" w:w="2835"/>
+            <w:tcW w:type="dxa" w:w="4873"/>
             <w:vAlign w:val="center"/>
             <w:shd w:fill="F2F5F8" w:val="clear"/>
           </w:tcPr>
@@ -6603,7 +6603,7 @@
         </w:tc>
         <w:tc>
           <w:tcPr>
-            <w:tcW w:type="dxa" w:w="6236"/>
+            <w:tcW w:type="dxa" w:w="4873"/>
             <w:vAlign w:val="center"/>
             <w:shd w:fill="F2F5F8" w:val="clear"/>
           </w:tcPr>
@@ -6623,7 +6623,7 @@
       <w:tr>
         <w:tc>
           <w:tcPr>
-            <w:tcW w:type="dxa" w:w="2835"/>
+            <w:tcW w:type="dxa" w:w="4873"/>
             <w:vAlign w:val="center"/>
           </w:tcPr>
           <w:p>
@@ -6640,7 +6640,7 @@
         </w:tc>
         <w:tc>
           <w:tcPr>
-            <w:tcW w:type="dxa" w:w="6236"/>
+            <w:tcW w:type="dxa" w:w="4873"/>
             <w:vAlign w:val="center"/>
           </w:tcPr>
           <w:p>
@@ -6659,7 +6659,7 @@
       <w:tr>
         <w:tc>
           <w:tcPr>
-            <w:tcW w:type="dxa" w:w="2835"/>
+            <w:tcW w:type="dxa" w:w="4873"/>
             <w:vAlign w:val="center"/>
             <w:shd w:fill="F2F5F8" w:val="clear"/>
           </w:tcPr>
@@ -6677,7 +6677,7 @@
         </w:tc>
         <w:tc>
           <w:tcPr>
-            <w:tcW w:type="dxa" w:w="6236"/>
+            <w:tcW w:type="dxa" w:w="4873"/>
             <w:vAlign w:val="center"/>
             <w:shd w:fill="F2F5F8" w:val="clear"/>
           </w:tcPr>
@@ -6697,7 +6697,7 @@
       <w:tr>
         <w:tc>
           <w:tcPr>
-            <w:tcW w:type="dxa" w:w="2835"/>
+            <w:tcW w:type="dxa" w:w="4873"/>
             <w:vAlign w:val="center"/>
           </w:tcPr>
           <w:p>
@@ -6714,7 +6714,7 @@
         </w:tc>
         <w:tc>
           <w:tcPr>
-            <w:tcW w:type="dxa" w:w="6236"/>
+            <w:tcW w:type="dxa" w:w="4873"/>
             <w:vAlign w:val="center"/>
           </w:tcPr>
           <w:p>
@@ -6733,7 +6733,7 @@
       <w:tr>
         <w:tc>
           <w:tcPr>
-            <w:tcW w:type="dxa" w:w="2835"/>
+            <w:tcW w:type="dxa" w:w="4873"/>
             <w:vAlign w:val="center"/>
             <w:shd w:fill="F2F5F8" w:val="clear"/>
           </w:tcPr>
@@ -6751,7 +6751,7 @@
         </w:tc>
         <w:tc>
           <w:tcPr>
-            <w:tcW w:type="dxa" w:w="6236"/>
+            <w:tcW w:type="dxa" w:w="4873"/>
             <w:vAlign w:val="center"/>
             <w:shd w:fill="F2F5F8" w:val="clear"/>
           </w:tcPr>
@@ -6867,7 +6867,7 @@
           <w:b w:val="0"/>
           <w:sz w:val="22"/>
         </w:rPr>
-        <w:t>Regresyon: mevcut Manual TDM PO Template ile üretilen PO alan parity karşılaştırması</w:t>
+        <w:t>Regresyon: Manual TDM PO Template ile üretilen PO alan parity karşılaştırması</w:t>
       </w:r>
     </w:p>
     <w:p>
@@ -6946,7 +6946,7 @@
       <w:tr>
         <w:tc>
           <w:tcPr>
-            <w:tcW w:type="dxa" w:w="2835"/>
+            <w:tcW w:type="dxa" w:w="3249"/>
             <w:vAlign w:val="center"/>
             <w:shd w:fill="1F3A5F" w:val="clear"/>
           </w:tcPr>
@@ -6965,7 +6965,7 @@
         </w:tc>
         <w:tc>
           <w:tcPr>
-            <w:tcW w:type="dxa" w:w="2268"/>
+            <w:tcW w:type="dxa" w:w="3249"/>
             <w:vAlign w:val="center"/>
             <w:shd w:fill="1F3A5F" w:val="clear"/>
           </w:tcPr>
@@ -6984,7 +6984,7 @@
         </w:tc>
         <w:tc>
           <w:tcPr>
-            <w:tcW w:type="dxa" w:w="3969"/>
+            <w:tcW w:type="dxa" w:w="3249"/>
             <w:vAlign w:val="center"/>
             <w:shd w:fill="1F3A5F" w:val="clear"/>
           </w:tcPr>
@@ -7005,7 +7005,7 @@
       <w:tr>
         <w:tc>
           <w:tcPr>
-            <w:tcW w:type="dxa" w:w="2835"/>
+            <w:tcW w:type="dxa" w:w="3249"/>
             <w:vAlign w:val="center"/>
           </w:tcPr>
           <w:p>
@@ -7022,7 +7022,7 @@
         </w:tc>
         <w:tc>
           <w:tcPr>
-            <w:tcW w:type="dxa" w:w="2268"/>
+            <w:tcW w:type="dxa" w:w="3249"/>
             <w:vAlign w:val="center"/>
           </w:tcPr>
           <w:p>
@@ -7039,7 +7039,7 @@
         </w:tc>
         <w:tc>
           <w:tcPr>
-            <w:tcW w:type="dxa" w:w="3969"/>
+            <w:tcW w:type="dxa" w:w="3249"/>
             <w:vAlign w:val="center"/>
           </w:tcPr>
           <w:p>
@@ -7058,7 +7058,7 @@
       <w:tr>
         <w:tc>
           <w:tcPr>
-            <w:tcW w:type="dxa" w:w="2835"/>
+            <w:tcW w:type="dxa" w:w="3249"/>
             <w:vAlign w:val="center"/>
             <w:shd w:fill="F2F5F8" w:val="clear"/>
           </w:tcPr>
@@ -7076,7 +7076,7 @@
         </w:tc>
         <w:tc>
           <w:tcPr>
-            <w:tcW w:type="dxa" w:w="2268"/>
+            <w:tcW w:type="dxa" w:w="3249"/>
             <w:vAlign w:val="center"/>
             <w:shd w:fill="F2F5F8" w:val="clear"/>
           </w:tcPr>
@@ -7094,7 +7094,7 @@
         </w:tc>
         <w:tc>
           <w:tcPr>
-            <w:tcW w:type="dxa" w:w="3969"/>
+            <w:tcW w:type="dxa" w:w="3249"/>
             <w:vAlign w:val="center"/>
             <w:shd w:fill="F2F5F8" w:val="clear"/>
           </w:tcPr>
@@ -7114,7 +7114,7 @@
       <w:tr>
         <w:tc>
           <w:tcPr>
-            <w:tcW w:type="dxa" w:w="2835"/>
+            <w:tcW w:type="dxa" w:w="3249"/>
             <w:vAlign w:val="center"/>
           </w:tcPr>
           <w:p>
@@ -7131,7 +7131,7 @@
         </w:tc>
         <w:tc>
           <w:tcPr>
-            <w:tcW w:type="dxa" w:w="2268"/>
+            <w:tcW w:type="dxa" w:w="3249"/>
             <w:vAlign w:val="center"/>
           </w:tcPr>
           <w:p>
@@ -7148,7 +7148,7 @@
         </w:tc>
         <w:tc>
           <w:tcPr>
-            <w:tcW w:type="dxa" w:w="3969"/>
+            <w:tcW w:type="dxa" w:w="3249"/>
             <w:vAlign w:val="center"/>
           </w:tcPr>
           <w:p>
@@ -7167,7 +7167,7 @@
       <w:tr>
         <w:tc>
           <w:tcPr>
-            <w:tcW w:type="dxa" w:w="2835"/>
+            <w:tcW w:type="dxa" w:w="3249"/>
             <w:vAlign w:val="center"/>
             <w:shd w:fill="F2F5F8" w:val="clear"/>
           </w:tcPr>
@@ -7185,7 +7185,7 @@
         </w:tc>
         <w:tc>
           <w:tcPr>
-            <w:tcW w:type="dxa" w:w="2268"/>
+            <w:tcW w:type="dxa" w:w="3249"/>
             <w:vAlign w:val="center"/>
             <w:shd w:fill="F2F5F8" w:val="clear"/>
           </w:tcPr>
@@ -7203,7 +7203,7 @@
         </w:tc>
         <w:tc>
           <w:tcPr>
-            <w:tcW w:type="dxa" w:w="3969"/>
+            <w:tcW w:type="dxa" w:w="3249"/>
             <w:vAlign w:val="center"/>
             <w:shd w:fill="F2F5F8" w:val="clear"/>
           </w:tcPr>
@@ -7223,7 +7223,7 @@
       <w:tr>
         <w:tc>
           <w:tcPr>
-            <w:tcW w:type="dxa" w:w="2835"/>
+            <w:tcW w:type="dxa" w:w="3249"/>
             <w:vAlign w:val="center"/>
           </w:tcPr>
           <w:p>
@@ -7240,7 +7240,7 @@
         </w:tc>
         <w:tc>
           <w:tcPr>
-            <w:tcW w:type="dxa" w:w="2268"/>
+            <w:tcW w:type="dxa" w:w="3249"/>
             <w:vAlign w:val="center"/>
           </w:tcPr>
           <w:p>
@@ -7257,7 +7257,7 @@
         </w:tc>
         <w:tc>
           <w:tcPr>
-            <w:tcW w:type="dxa" w:w="3969"/>
+            <w:tcW w:type="dxa" w:w="3249"/>
             <w:vAlign w:val="center"/>
           </w:tcPr>
           <w:p>
@@ -7276,7 +7276,7 @@
       <w:tr>
         <w:tc>
           <w:tcPr>
-            <w:tcW w:type="dxa" w:w="2835"/>
+            <w:tcW w:type="dxa" w:w="3249"/>
             <w:vAlign w:val="center"/>
             <w:shd w:fill="F2F5F8" w:val="clear"/>
           </w:tcPr>
@@ -7294,7 +7294,7 @@
         </w:tc>
         <w:tc>
           <w:tcPr>
-            <w:tcW w:type="dxa" w:w="2268"/>
+            <w:tcW w:type="dxa" w:w="3249"/>
             <w:vAlign w:val="center"/>
             <w:shd w:fill="F2F5F8" w:val="clear"/>
           </w:tcPr>
@@ -7312,7 +7312,7 @@
         </w:tc>
         <w:tc>
           <w:tcPr>
-            <w:tcW w:type="dxa" w:w="3969"/>
+            <w:tcW w:type="dxa" w:w="3249"/>
             <w:vAlign w:val="center"/>
             <w:shd w:fill="F2F5F8" w:val="clear"/>
           </w:tcPr>
@@ -7332,7 +7332,7 @@
       <w:tr>
         <w:tc>
           <w:tcPr>
-            <w:tcW w:type="dxa" w:w="2835"/>
+            <w:tcW w:type="dxa" w:w="3249"/>
             <w:vAlign w:val="center"/>
           </w:tcPr>
           <w:p>
@@ -7349,7 +7349,7 @@
         </w:tc>
         <w:tc>
           <w:tcPr>
-            <w:tcW w:type="dxa" w:w="2268"/>
+            <w:tcW w:type="dxa" w:w="3249"/>
             <w:vAlign w:val="center"/>
           </w:tcPr>
           <w:p>
@@ -7366,7 +7366,7 @@
         </w:tc>
         <w:tc>
           <w:tcPr>
-            <w:tcW w:type="dxa" w:w="3969"/>
+            <w:tcW w:type="dxa" w:w="3249"/>
             <w:vAlign w:val="center"/>
           </w:tcPr>
           <w:p>
@@ -7410,7 +7410,7 @@
       <w:tr>
         <w:tc>
           <w:tcPr>
-            <w:tcW w:type="dxa" w:w="2268"/>
+            <w:tcW w:type="dxa" w:w="3249"/>
             <w:vAlign w:val="center"/>
             <w:shd w:fill="1F3A5F" w:val="clear"/>
           </w:tcPr>
@@ -7429,7 +7429,7 @@
         </w:tc>
         <w:tc>
           <w:tcPr>
-            <w:tcW w:type="dxa" w:w="3118"/>
+            <w:tcW w:type="dxa" w:w="3249"/>
             <w:vAlign w:val="center"/>
             <w:shd w:fill="1F3A5F" w:val="clear"/>
           </w:tcPr>
@@ -7448,7 +7448,7 @@
         </w:tc>
         <w:tc>
           <w:tcPr>
-            <w:tcW w:type="dxa" w:w="3685"/>
+            <w:tcW w:type="dxa" w:w="3249"/>
             <w:vAlign w:val="center"/>
             <w:shd w:fill="1F3A5F" w:val="clear"/>
           </w:tcPr>
@@ -7469,7 +7469,7 @@
       <w:tr>
         <w:tc>
           <w:tcPr>
-            <w:tcW w:type="dxa" w:w="2268"/>
+            <w:tcW w:type="dxa" w:w="3249"/>
             <w:vAlign w:val="center"/>
           </w:tcPr>
           <w:p>
@@ -7486,7 +7486,7 @@
         </w:tc>
         <w:tc>
           <w:tcPr>
-            <w:tcW w:type="dxa" w:w="3118"/>
+            <w:tcW w:type="dxa" w:w="3249"/>
             <w:vAlign w:val="center"/>
           </w:tcPr>
           <w:p>
@@ -7503,7 +7503,7 @@
         </w:tc>
         <w:tc>
           <w:tcPr>
-            <w:tcW w:type="dxa" w:w="3685"/>
+            <w:tcW w:type="dxa" w:w="3249"/>
             <w:vAlign w:val="center"/>
           </w:tcPr>
           <w:p>
@@ -7522,7 +7522,7 @@
       <w:tr>
         <w:tc>
           <w:tcPr>
-            <w:tcW w:type="dxa" w:w="2268"/>
+            <w:tcW w:type="dxa" w:w="3249"/>
             <w:vAlign w:val="center"/>
             <w:shd w:fill="F2F5F8" w:val="clear"/>
           </w:tcPr>
@@ -7540,7 +7540,7 @@
         </w:tc>
         <w:tc>
           <w:tcPr>
-            <w:tcW w:type="dxa" w:w="3118"/>
+            <w:tcW w:type="dxa" w:w="3249"/>
             <w:vAlign w:val="center"/>
             <w:shd w:fill="F2F5F8" w:val="clear"/>
           </w:tcPr>
@@ -7558,7 +7558,7 @@
         </w:tc>
         <w:tc>
           <w:tcPr>
-            <w:tcW w:type="dxa" w:w="3685"/>
+            <w:tcW w:type="dxa" w:w="3249"/>
             <w:vAlign w:val="center"/>
             <w:shd w:fill="F2F5F8" w:val="clear"/>
           </w:tcPr>
@@ -7578,7 +7578,7 @@
       <w:tr>
         <w:tc>
           <w:tcPr>
-            <w:tcW w:type="dxa" w:w="2268"/>
+            <w:tcW w:type="dxa" w:w="3249"/>
             <w:vAlign w:val="center"/>
           </w:tcPr>
           <w:p>
@@ -7595,7 +7595,7 @@
         </w:tc>
         <w:tc>
           <w:tcPr>
-            <w:tcW w:type="dxa" w:w="3118"/>
+            <w:tcW w:type="dxa" w:w="3249"/>
             <w:vAlign w:val="center"/>
           </w:tcPr>
           <w:p>
@@ -7612,7 +7612,7 @@
         </w:tc>
         <w:tc>
           <w:tcPr>
-            <w:tcW w:type="dxa" w:w="3685"/>
+            <w:tcW w:type="dxa" w:w="3249"/>
             <w:vAlign w:val="center"/>
           </w:tcPr>
           <w:p>
@@ -7664,7 +7664,7 @@
           <w:b w:val="0"/>
           <w:sz w:val="22"/>
         </w:rPr>
-        <w:t>Süreç akış şeması ve ekran vizyon sunumu (Barbaros Songur)</w:t>
+        <w:t>Süreç akış şeması ve ekran vizyon sunumu</w:t>
       </w:r>
     </w:p>
     <w:p>
@@ -7821,7 +7821,6 @@
         <w:t>TIM örnek dataset ile sandboxed uçtan uca prototip</w:t>
       </w:r>
     </w:p>
-    <w:p/>
     <w:p>
       <w:pPr>
         <w:jc w:val="center"/>

</xml_diff>